<commit_message>
style(manuscript): enforce full justification, consistent paragraph spacing, and unnumbered hanging references
</commit_message>
<xml_diff>
--- a/docs/MANUSCRIPT_WARA_PATHOGENS.docx
+++ b/docs/MANUSCRIPT_WARA_PATHOGENS.docx
@@ -4,7 +4,7 @@
   <w:body>
     <w:p>
       <w:pPr>
-        <w:spacing w:before="240" w:after="240" w:line="288" w:lineRule="auto"/>
+        <w:spacing w:before="0" w:after="240" w:line="276" w:lineRule="auto"/>
         <w:jc w:val="center"/>
       </w:pPr>
       <w:r>
@@ -19,7 +19,7 @@
     </w:p>
     <w:p>
       <w:pPr>
-        <w:spacing w:before="40" w:after="80" w:line="276" w:lineRule="auto"/>
+        <w:spacing w:before="40" w:after="60" w:line="276" w:lineRule="auto"/>
         <w:jc w:val="center"/>
       </w:pPr>
       <w:r>
@@ -34,7 +34,7 @@
     </w:p>
     <w:p>
       <w:pPr>
-        <w:spacing w:before="40" w:after="80" w:line="276" w:lineRule="auto"/>
+        <w:spacing w:before="40" w:after="60" w:line="276" w:lineRule="auto"/>
         <w:jc w:val="center"/>
       </w:pPr>
       <w:r>
@@ -49,7 +49,7 @@
     </w:p>
     <w:p>
       <w:pPr>
-        <w:spacing w:before="40" w:after="80" w:line="276" w:lineRule="auto"/>
+        <w:spacing w:before="40" w:after="60" w:line="276" w:lineRule="auto"/>
         <w:jc w:val="center"/>
       </w:pPr>
       <w:r>
@@ -244,15 +244,15 @@
     </w:p>
     <w:p>
       <w:pPr>
-        <w:spacing w:before="0" w:after="120" w:line="276" w:lineRule="auto"/>
-        <w:jc w:val="both"/>
+        <w:spacing w:before="40" w:after="60" w:line="276" w:lineRule="auto"/>
+        <w:jc w:val="center"/>
       </w:pPr>
       <w:r>
         <w:rPr>
           <w:rFonts w:ascii="Times New Roman" w:hAnsi="Times New Roman"/>
           <w:b w:val="0"/>
           <w:i w:val="0"/>
-          <w:sz w:val="24"/>
+          <w:sz w:val="22"/>
         </w:rPr>
         <w:t>Fresh Wara samples were purchased from independent commercial dairy vendors at Ojoo Main Market, Ibadan, Oyo State, Nigeria. Sampling was conducted aseptically during peak morning market hours. Samples were immediately transferred into sterile polyethene containers and transported on ice packs to the Microbiology Laboratory, Department of Microbiology, University of Ibadan, within two hours of collection. All sampled cheeses were confirmed to be unpasteurized and coagulated using traditional Calotropis procera extracts.</w:t>
       </w:r>
@@ -334,7 +334,7 @@
     </w:p>
     <w:p>
       <w:pPr>
-        <w:spacing w:before="40" w:after="80" w:line="276" w:lineRule="auto"/>
+        <w:spacing w:before="0" w:after="120" w:line="276" w:lineRule="auto"/>
         <w:jc w:val="both"/>
       </w:pPr>
       <w:r>
@@ -349,7 +349,7 @@
     </w:p>
     <w:p>
       <w:pPr>
-        <w:spacing w:before="40" w:after="80" w:line="276" w:lineRule="auto"/>
+        <w:spacing w:before="0" w:after="120" w:line="276" w:lineRule="auto"/>
         <w:jc w:val="both"/>
       </w:pPr>
       <w:r>
@@ -364,7 +364,7 @@
     </w:p>
     <w:p>
       <w:pPr>
-        <w:spacing w:before="40" w:after="80" w:line="276" w:lineRule="auto"/>
+        <w:spacing w:before="0" w:after="120" w:line="276" w:lineRule="auto"/>
         <w:jc w:val="both"/>
       </w:pPr>
       <w:r>
@@ -379,7 +379,7 @@
     </w:p>
     <w:p>
       <w:pPr>
-        <w:spacing w:before="40" w:after="80" w:line="276" w:lineRule="auto"/>
+        <w:spacing w:before="0" w:after="120" w:line="276" w:lineRule="auto"/>
         <w:jc w:val="both"/>
       </w:pPr>
       <w:r>
@@ -394,7 +394,7 @@
     </w:p>
     <w:p>
       <w:pPr>
-        <w:spacing w:before="40" w:after="80" w:line="276" w:lineRule="auto"/>
+        <w:spacing w:before="0" w:after="120" w:line="276" w:lineRule="auto"/>
         <w:jc w:val="both"/>
       </w:pPr>
       <w:r>
@@ -409,7 +409,7 @@
     </w:p>
     <w:p>
       <w:pPr>
-        <w:spacing w:before="40" w:after="80" w:line="276" w:lineRule="auto"/>
+        <w:spacing w:before="0" w:after="120" w:line="276" w:lineRule="auto"/>
         <w:jc w:val="both"/>
       </w:pPr>
       <w:r>
@@ -454,7 +454,7 @@
     </w:p>
     <w:p>
       <w:pPr>
-        <w:spacing w:before="40" w:after="80" w:line="276" w:lineRule="auto"/>
+        <w:spacing w:before="0" w:after="120" w:line="276" w:lineRule="auto"/>
         <w:jc w:val="both"/>
       </w:pPr>
       <w:r>
@@ -469,7 +469,7 @@
     </w:p>
     <w:p>
       <w:pPr>
-        <w:spacing w:before="40" w:after="80" w:line="276" w:lineRule="auto"/>
+        <w:spacing w:before="0" w:after="120" w:line="276" w:lineRule="auto"/>
         <w:jc w:val="both"/>
       </w:pPr>
       <w:r>
@@ -484,7 +484,7 @@
     </w:p>
     <w:p>
       <w:pPr>
-        <w:spacing w:before="40" w:after="80" w:line="276" w:lineRule="auto"/>
+        <w:spacing w:before="0" w:after="120" w:line="276" w:lineRule="auto"/>
         <w:jc w:val="both"/>
       </w:pPr>
       <w:r>
@@ -613,7 +613,7 @@
     </w:p>
     <w:p>
       <w:pPr>
-        <w:spacing w:before="40" w:after="80" w:line="276" w:lineRule="auto"/>
+        <w:spacing w:before="0" w:after="120" w:line="276" w:lineRule="auto"/>
         <w:jc w:val="both"/>
       </w:pPr>
       <w:r>
@@ -628,7 +628,7 @@
     </w:p>
     <w:p>
       <w:pPr>
-        <w:spacing w:before="40" w:after="80" w:line="276" w:lineRule="auto"/>
+        <w:spacing w:before="0" w:after="120" w:line="276" w:lineRule="auto"/>
         <w:jc w:val="both"/>
       </w:pPr>
       <w:r>
@@ -643,7 +643,7 @@
     </w:p>
     <w:p>
       <w:pPr>
-        <w:spacing w:before="40" w:after="80" w:line="276" w:lineRule="auto"/>
+        <w:spacing w:before="0" w:after="120" w:line="276" w:lineRule="auto"/>
         <w:jc w:val="both"/>
       </w:pPr>
       <w:r>
@@ -658,7 +658,7 @@
     </w:p>
     <w:p>
       <w:pPr>
-        <w:spacing w:before="40" w:after="80" w:line="276" w:lineRule="auto"/>
+        <w:spacing w:before="0" w:after="120" w:line="276" w:lineRule="auto"/>
         <w:jc w:val="both"/>
       </w:pPr>
       <w:r>
@@ -673,7 +673,7 @@
     </w:p>
     <w:p>
       <w:pPr>
-        <w:spacing w:before="40" w:after="80" w:line="276" w:lineRule="auto"/>
+        <w:spacing w:before="0" w:after="120" w:line="276" w:lineRule="auto"/>
         <w:jc w:val="both"/>
       </w:pPr>
       <w:r>
@@ -688,7 +688,7 @@
     </w:p>
     <w:p>
       <w:pPr>
-        <w:spacing w:before="40" w:after="80" w:line="276" w:lineRule="auto"/>
+        <w:spacing w:before="0" w:after="120" w:line="276" w:lineRule="auto"/>
         <w:jc w:val="both"/>
       </w:pPr>
       <w:r>
@@ -718,7 +718,7 @@
     </w:p>
     <w:p>
       <w:pPr>
-        <w:spacing w:before="40" w:after="80" w:line="276" w:lineRule="auto"/>
+        <w:spacing w:before="0" w:after="120" w:line="276" w:lineRule="auto"/>
         <w:jc w:val="both"/>
       </w:pPr>
       <w:r>
@@ -733,7 +733,7 @@
     </w:p>
     <w:p>
       <w:pPr>
-        <w:spacing w:before="40" w:after="80" w:line="276" w:lineRule="auto"/>
+        <w:spacing w:before="0" w:after="120" w:line="276" w:lineRule="auto"/>
         <w:jc w:val="both"/>
       </w:pPr>
       <w:r>
@@ -748,7 +748,7 @@
     </w:p>
     <w:p>
       <w:pPr>
-        <w:spacing w:before="40" w:after="80" w:line="276" w:lineRule="auto"/>
+        <w:spacing w:before="0" w:after="120" w:line="276" w:lineRule="auto"/>
         <w:jc w:val="both"/>
       </w:pPr>
       <w:r>
@@ -763,7 +763,7 @@
     </w:p>
     <w:p>
       <w:pPr>
-        <w:spacing w:before="40" w:after="80" w:line="276" w:lineRule="auto"/>
+        <w:spacing w:before="0" w:after="120" w:line="276" w:lineRule="auto"/>
         <w:jc w:val="both"/>
       </w:pPr>
       <w:r>
@@ -853,7 +853,7 @@
     </w:p>
     <w:p>
       <w:pPr>
-        <w:spacing w:before="160" w:after="80" w:line="276" w:lineRule="auto"/>
+        <w:spacing w:before="200" w:after="80" w:line="276" w:lineRule="auto"/>
         <w:jc w:val="left"/>
       </w:pPr>
       <w:r>
@@ -884,15 +884,15 @@
           <w:tcPr>
             <w:tcW w:type="dxa" w:w="2340"/>
             <w:tcBorders>
-              <w:top w:val="single" w:sz="4" w:space="0" w:color="000000"/>
-              <w:bottom w:val="single" w:sz="4" w:space="0" w:color="000000"/>
+              <w:top w:val="single" w:sz="6" w:space="0" w:color="000000"/>
+              <w:bottom w:val="single" w:sz="6" w:space="0" w:color="000000"/>
               <w:left w:val="none"/>
               <w:right w:val="none"/>
             </w:tcBorders>
           </w:tcPr>
           <w:p>
             <w:pPr>
-              <w:spacing w:before="40" w:after="40" w:line="240" w:lineRule="auto"/>
+              <w:spacing w:before="60" w:after="60" w:line="240" w:lineRule="auto"/>
             </w:pPr>
             <w:r/>
             <w:r>
@@ -909,15 +909,15 @@
           <w:tcPr>
             <w:tcW w:type="dxa" w:w="2340"/>
             <w:tcBorders>
-              <w:top w:val="single" w:sz="4" w:space="0" w:color="000000"/>
-              <w:bottom w:val="single" w:sz="4" w:space="0" w:color="000000"/>
+              <w:top w:val="single" w:sz="6" w:space="0" w:color="000000"/>
+              <w:bottom w:val="single" w:sz="6" w:space="0" w:color="000000"/>
               <w:left w:val="none"/>
               <w:right w:val="none"/>
             </w:tcBorders>
           </w:tcPr>
           <w:p>
             <w:pPr>
-              <w:spacing w:before="40" w:after="40" w:line="240" w:lineRule="auto"/>
+              <w:spacing w:before="60" w:after="60" w:line="240" w:lineRule="auto"/>
             </w:pPr>
             <w:r/>
             <w:r>
@@ -934,15 +934,15 @@
           <w:tcPr>
             <w:tcW w:type="dxa" w:w="2340"/>
             <w:tcBorders>
-              <w:top w:val="single" w:sz="4" w:space="0" w:color="000000"/>
-              <w:bottom w:val="single" w:sz="4" w:space="0" w:color="000000"/>
+              <w:top w:val="single" w:sz="6" w:space="0" w:color="000000"/>
+              <w:bottom w:val="single" w:sz="6" w:space="0" w:color="000000"/>
               <w:left w:val="none"/>
               <w:right w:val="none"/>
             </w:tcBorders>
           </w:tcPr>
           <w:p>
             <w:pPr>
-              <w:spacing w:before="40" w:after="40" w:line="240" w:lineRule="auto"/>
+              <w:spacing w:before="60" w:after="60" w:line="240" w:lineRule="auto"/>
             </w:pPr>
             <w:r/>
             <w:r>
@@ -959,15 +959,15 @@
           <w:tcPr>
             <w:tcW w:type="dxa" w:w="2340"/>
             <w:tcBorders>
-              <w:top w:val="single" w:sz="4" w:space="0" w:color="000000"/>
-              <w:bottom w:val="single" w:sz="4" w:space="0" w:color="000000"/>
+              <w:top w:val="single" w:sz="6" w:space="0" w:color="000000"/>
+              <w:bottom w:val="single" w:sz="6" w:space="0" w:color="000000"/>
               <w:left w:val="none"/>
               <w:right w:val="none"/>
             </w:tcBorders>
           </w:tcPr>
           <w:p>
             <w:pPr>
-              <w:spacing w:before="40" w:after="40" w:line="240" w:lineRule="auto"/>
+              <w:spacing w:before="60" w:after="60" w:line="240" w:lineRule="auto"/>
             </w:pPr>
             <w:r/>
             <w:r>
@@ -986,15 +986,15 @@
           <w:tcPr>
             <w:tcW w:type="dxa" w:w="2340"/>
             <w:tcBorders>
-              <w:top w:val="none" w:sz="4" w:space="0" w:color="000000"/>
-              <w:bottom w:val="none" w:sz="4" w:space="0" w:color="000000"/>
+              <w:top w:val="none" w:sz="6" w:space="0" w:color="000000"/>
+              <w:bottom w:val="none" w:sz="6" w:space="0" w:color="000000"/>
               <w:left w:val="none"/>
               <w:right w:val="none"/>
             </w:tcBorders>
           </w:tcPr>
           <w:p>
             <w:pPr>
-              <w:spacing w:before="40" w:after="40" w:line="240" w:lineRule="auto"/>
+              <w:spacing w:before="60" w:after="60" w:line="240" w:lineRule="auto"/>
             </w:pPr>
             <w:r/>
             <w:r>
@@ -1011,15 +1011,15 @@
           <w:tcPr>
             <w:tcW w:type="dxa" w:w="2340"/>
             <w:tcBorders>
-              <w:top w:val="none" w:sz="4" w:space="0" w:color="000000"/>
-              <w:bottom w:val="none" w:sz="4" w:space="0" w:color="000000"/>
+              <w:top w:val="none" w:sz="6" w:space="0" w:color="000000"/>
+              <w:bottom w:val="none" w:sz="6" w:space="0" w:color="000000"/>
               <w:left w:val="none"/>
               <w:right w:val="none"/>
             </w:tcBorders>
           </w:tcPr>
           <w:p>
             <w:pPr>
-              <w:spacing w:before="40" w:after="40" w:line="240" w:lineRule="auto"/>
+              <w:spacing w:before="60" w:after="60" w:line="240" w:lineRule="auto"/>
             </w:pPr>
             <w:r/>
             <w:r>
@@ -1036,15 +1036,15 @@
           <w:tcPr>
             <w:tcW w:type="dxa" w:w="2340"/>
             <w:tcBorders>
-              <w:top w:val="none" w:sz="4" w:space="0" w:color="000000"/>
-              <w:bottom w:val="none" w:sz="4" w:space="0" w:color="000000"/>
+              <w:top w:val="none" w:sz="6" w:space="0" w:color="000000"/>
+              <w:bottom w:val="none" w:sz="6" w:space="0" w:color="000000"/>
               <w:left w:val="none"/>
               <w:right w:val="none"/>
             </w:tcBorders>
           </w:tcPr>
           <w:p>
             <w:pPr>
-              <w:spacing w:before="40" w:after="40" w:line="240" w:lineRule="auto"/>
+              <w:spacing w:before="60" w:after="60" w:line="240" w:lineRule="auto"/>
             </w:pPr>
             <w:r/>
             <w:r>
@@ -1061,15 +1061,15 @@
           <w:tcPr>
             <w:tcW w:type="dxa" w:w="2340"/>
             <w:tcBorders>
-              <w:top w:val="none" w:sz="4" w:space="0" w:color="000000"/>
-              <w:bottom w:val="none" w:sz="4" w:space="0" w:color="000000"/>
+              <w:top w:val="none" w:sz="6" w:space="0" w:color="000000"/>
+              <w:bottom w:val="none" w:sz="6" w:space="0" w:color="000000"/>
               <w:left w:val="none"/>
               <w:right w:val="none"/>
             </w:tcBorders>
           </w:tcPr>
           <w:p>
             <w:pPr>
-              <w:spacing w:before="40" w:after="40" w:line="240" w:lineRule="auto"/>
+              <w:spacing w:before="60" w:after="60" w:line="240" w:lineRule="auto"/>
             </w:pPr>
             <w:r/>
             <w:r>
@@ -1088,15 +1088,15 @@
           <w:tcPr>
             <w:tcW w:type="dxa" w:w="2340"/>
             <w:tcBorders>
-              <w:top w:val="none" w:sz="4" w:space="0" w:color="000000"/>
-              <w:bottom w:val="none" w:sz="4" w:space="0" w:color="000000"/>
+              <w:top w:val="none" w:sz="6" w:space="0" w:color="000000"/>
+              <w:bottom w:val="none" w:sz="6" w:space="0" w:color="000000"/>
               <w:left w:val="none"/>
               <w:right w:val="none"/>
             </w:tcBorders>
           </w:tcPr>
           <w:p>
             <w:pPr>
-              <w:spacing w:before="40" w:after="40" w:line="240" w:lineRule="auto"/>
+              <w:spacing w:before="60" w:after="60" w:line="240" w:lineRule="auto"/>
             </w:pPr>
             <w:r/>
             <w:r>
@@ -1113,15 +1113,15 @@
           <w:tcPr>
             <w:tcW w:type="dxa" w:w="2340"/>
             <w:tcBorders>
-              <w:top w:val="none" w:sz="4" w:space="0" w:color="000000"/>
-              <w:bottom w:val="none" w:sz="4" w:space="0" w:color="000000"/>
+              <w:top w:val="none" w:sz="6" w:space="0" w:color="000000"/>
+              <w:bottom w:val="none" w:sz="6" w:space="0" w:color="000000"/>
               <w:left w:val="none"/>
               <w:right w:val="none"/>
             </w:tcBorders>
           </w:tcPr>
           <w:p>
             <w:pPr>
-              <w:spacing w:before="40" w:after="40" w:line="240" w:lineRule="auto"/>
+              <w:spacing w:before="60" w:after="60" w:line="240" w:lineRule="auto"/>
             </w:pPr>
             <w:r/>
             <w:r>
@@ -1138,15 +1138,15 @@
           <w:tcPr>
             <w:tcW w:type="dxa" w:w="2340"/>
             <w:tcBorders>
-              <w:top w:val="none" w:sz="4" w:space="0" w:color="000000"/>
-              <w:bottom w:val="none" w:sz="4" w:space="0" w:color="000000"/>
+              <w:top w:val="none" w:sz="6" w:space="0" w:color="000000"/>
+              <w:bottom w:val="none" w:sz="6" w:space="0" w:color="000000"/>
               <w:left w:val="none"/>
               <w:right w:val="none"/>
             </w:tcBorders>
           </w:tcPr>
           <w:p>
             <w:pPr>
-              <w:spacing w:before="40" w:after="40" w:line="240" w:lineRule="auto"/>
+              <w:spacing w:before="60" w:after="60" w:line="240" w:lineRule="auto"/>
             </w:pPr>
             <w:r/>
             <w:r>
@@ -1163,15 +1163,15 @@
           <w:tcPr>
             <w:tcW w:type="dxa" w:w="2340"/>
             <w:tcBorders>
-              <w:top w:val="none" w:sz="4" w:space="0" w:color="000000"/>
-              <w:bottom w:val="none" w:sz="4" w:space="0" w:color="000000"/>
+              <w:top w:val="none" w:sz="6" w:space="0" w:color="000000"/>
+              <w:bottom w:val="none" w:sz="6" w:space="0" w:color="000000"/>
               <w:left w:val="none"/>
               <w:right w:val="none"/>
             </w:tcBorders>
           </w:tcPr>
           <w:p>
             <w:pPr>
-              <w:spacing w:before="40" w:after="40" w:line="240" w:lineRule="auto"/>
+              <w:spacing w:before="60" w:after="60" w:line="240" w:lineRule="auto"/>
             </w:pPr>
             <w:r/>
             <w:r>
@@ -1190,15 +1190,15 @@
           <w:tcPr>
             <w:tcW w:type="dxa" w:w="2340"/>
             <w:tcBorders>
-              <w:top w:val="none" w:sz="4" w:space="0" w:color="000000"/>
-              <w:bottom w:val="none" w:sz="4" w:space="0" w:color="000000"/>
+              <w:top w:val="none" w:sz="6" w:space="0" w:color="000000"/>
+              <w:bottom w:val="none" w:sz="6" w:space="0" w:color="000000"/>
               <w:left w:val="none"/>
               <w:right w:val="none"/>
             </w:tcBorders>
           </w:tcPr>
           <w:p>
             <w:pPr>
-              <w:spacing w:before="40" w:after="40" w:line="240" w:lineRule="auto"/>
+              <w:spacing w:before="60" w:after="60" w:line="240" w:lineRule="auto"/>
             </w:pPr>
             <w:r/>
             <w:r>
@@ -1215,15 +1215,15 @@
           <w:tcPr>
             <w:tcW w:type="dxa" w:w="2340"/>
             <w:tcBorders>
-              <w:top w:val="none" w:sz="4" w:space="0" w:color="000000"/>
-              <w:bottom w:val="none" w:sz="4" w:space="0" w:color="000000"/>
+              <w:top w:val="none" w:sz="6" w:space="0" w:color="000000"/>
+              <w:bottom w:val="none" w:sz="6" w:space="0" w:color="000000"/>
               <w:left w:val="none"/>
               <w:right w:val="none"/>
             </w:tcBorders>
           </w:tcPr>
           <w:p>
             <w:pPr>
-              <w:spacing w:before="40" w:after="40" w:line="240" w:lineRule="auto"/>
+              <w:spacing w:before="60" w:after="60" w:line="240" w:lineRule="auto"/>
             </w:pPr>
             <w:r/>
             <w:r>
@@ -1240,15 +1240,15 @@
           <w:tcPr>
             <w:tcW w:type="dxa" w:w="2340"/>
             <w:tcBorders>
-              <w:top w:val="none" w:sz="4" w:space="0" w:color="000000"/>
-              <w:bottom w:val="none" w:sz="4" w:space="0" w:color="000000"/>
+              <w:top w:val="none" w:sz="6" w:space="0" w:color="000000"/>
+              <w:bottom w:val="none" w:sz="6" w:space="0" w:color="000000"/>
               <w:left w:val="none"/>
               <w:right w:val="none"/>
             </w:tcBorders>
           </w:tcPr>
           <w:p>
             <w:pPr>
-              <w:spacing w:before="40" w:after="40" w:line="240" w:lineRule="auto"/>
+              <w:spacing w:before="60" w:after="60" w:line="240" w:lineRule="auto"/>
             </w:pPr>
             <w:r/>
             <w:r>
@@ -1265,15 +1265,15 @@
           <w:tcPr>
             <w:tcW w:type="dxa" w:w="2340"/>
             <w:tcBorders>
-              <w:top w:val="none" w:sz="4" w:space="0" w:color="000000"/>
-              <w:bottom w:val="none" w:sz="4" w:space="0" w:color="000000"/>
+              <w:top w:val="none" w:sz="6" w:space="0" w:color="000000"/>
+              <w:bottom w:val="none" w:sz="6" w:space="0" w:color="000000"/>
               <w:left w:val="none"/>
               <w:right w:val="none"/>
             </w:tcBorders>
           </w:tcPr>
           <w:p>
             <w:pPr>
-              <w:spacing w:before="40" w:after="40" w:line="240" w:lineRule="auto"/>
+              <w:spacing w:before="60" w:after="60" w:line="240" w:lineRule="auto"/>
             </w:pPr>
             <w:r/>
             <w:r>
@@ -1292,15 +1292,15 @@
           <w:tcPr>
             <w:tcW w:type="dxa" w:w="2340"/>
             <w:tcBorders>
-              <w:top w:val="none" w:sz="4" w:space="0" w:color="000000"/>
-              <w:bottom w:val="none" w:sz="4" w:space="0" w:color="000000"/>
+              <w:top w:val="none" w:sz="6" w:space="0" w:color="000000"/>
+              <w:bottom w:val="none" w:sz="6" w:space="0" w:color="000000"/>
               <w:left w:val="none"/>
               <w:right w:val="none"/>
             </w:tcBorders>
           </w:tcPr>
           <w:p>
             <w:pPr>
-              <w:spacing w:before="40" w:after="40" w:line="240" w:lineRule="auto"/>
+              <w:spacing w:before="60" w:after="60" w:line="240" w:lineRule="auto"/>
             </w:pPr>
             <w:r/>
             <w:r>
@@ -1317,15 +1317,15 @@
           <w:tcPr>
             <w:tcW w:type="dxa" w:w="2340"/>
             <w:tcBorders>
-              <w:top w:val="none" w:sz="4" w:space="0" w:color="000000"/>
-              <w:bottom w:val="none" w:sz="4" w:space="0" w:color="000000"/>
+              <w:top w:val="none" w:sz="6" w:space="0" w:color="000000"/>
+              <w:bottom w:val="none" w:sz="6" w:space="0" w:color="000000"/>
               <w:left w:val="none"/>
               <w:right w:val="none"/>
             </w:tcBorders>
           </w:tcPr>
           <w:p>
             <w:pPr>
-              <w:spacing w:before="40" w:after="40" w:line="240" w:lineRule="auto"/>
+              <w:spacing w:before="60" w:after="60" w:line="240" w:lineRule="auto"/>
             </w:pPr>
             <w:r/>
             <w:r>
@@ -1342,15 +1342,15 @@
           <w:tcPr>
             <w:tcW w:type="dxa" w:w="2340"/>
             <w:tcBorders>
-              <w:top w:val="none" w:sz="4" w:space="0" w:color="000000"/>
-              <w:bottom w:val="none" w:sz="4" w:space="0" w:color="000000"/>
+              <w:top w:val="none" w:sz="6" w:space="0" w:color="000000"/>
+              <w:bottom w:val="none" w:sz="6" w:space="0" w:color="000000"/>
               <w:left w:val="none"/>
               <w:right w:val="none"/>
             </w:tcBorders>
           </w:tcPr>
           <w:p>
             <w:pPr>
-              <w:spacing w:before="40" w:after="40" w:line="240" w:lineRule="auto"/>
+              <w:spacing w:before="60" w:after="60" w:line="240" w:lineRule="auto"/>
             </w:pPr>
             <w:r/>
             <w:r>
@@ -1367,15 +1367,15 @@
           <w:tcPr>
             <w:tcW w:type="dxa" w:w="2340"/>
             <w:tcBorders>
-              <w:top w:val="none" w:sz="4" w:space="0" w:color="000000"/>
-              <w:bottom w:val="none" w:sz="4" w:space="0" w:color="000000"/>
+              <w:top w:val="none" w:sz="6" w:space="0" w:color="000000"/>
+              <w:bottom w:val="none" w:sz="6" w:space="0" w:color="000000"/>
               <w:left w:val="none"/>
               <w:right w:val="none"/>
             </w:tcBorders>
           </w:tcPr>
           <w:p>
             <w:pPr>
-              <w:spacing w:before="40" w:after="40" w:line="240" w:lineRule="auto"/>
+              <w:spacing w:before="60" w:after="60" w:line="240" w:lineRule="auto"/>
             </w:pPr>
             <w:r/>
             <w:r>
@@ -1394,15 +1394,15 @@
           <w:tcPr>
             <w:tcW w:type="dxa" w:w="2340"/>
             <w:tcBorders>
-              <w:top w:val="none" w:sz="4" w:space="0" w:color="000000"/>
-              <w:bottom w:val="none" w:sz="4" w:space="0" w:color="000000"/>
+              <w:top w:val="none" w:sz="6" w:space="0" w:color="000000"/>
+              <w:bottom w:val="none" w:sz="6" w:space="0" w:color="000000"/>
               <w:left w:val="none"/>
               <w:right w:val="none"/>
             </w:tcBorders>
           </w:tcPr>
           <w:p>
             <w:pPr>
-              <w:spacing w:before="40" w:after="40" w:line="240" w:lineRule="auto"/>
+              <w:spacing w:before="60" w:after="60" w:line="240" w:lineRule="auto"/>
             </w:pPr>
             <w:r/>
             <w:r>
@@ -1419,15 +1419,15 @@
           <w:tcPr>
             <w:tcW w:type="dxa" w:w="2340"/>
             <w:tcBorders>
-              <w:top w:val="none" w:sz="4" w:space="0" w:color="000000"/>
-              <w:bottom w:val="none" w:sz="4" w:space="0" w:color="000000"/>
+              <w:top w:val="none" w:sz="6" w:space="0" w:color="000000"/>
+              <w:bottom w:val="none" w:sz="6" w:space="0" w:color="000000"/>
               <w:left w:val="none"/>
               <w:right w:val="none"/>
             </w:tcBorders>
           </w:tcPr>
           <w:p>
             <w:pPr>
-              <w:spacing w:before="40" w:after="40" w:line="240" w:lineRule="auto"/>
+              <w:spacing w:before="60" w:after="60" w:line="240" w:lineRule="auto"/>
             </w:pPr>
             <w:r/>
             <w:r>
@@ -1444,15 +1444,15 @@
           <w:tcPr>
             <w:tcW w:type="dxa" w:w="2340"/>
             <w:tcBorders>
-              <w:top w:val="none" w:sz="4" w:space="0" w:color="000000"/>
-              <w:bottom w:val="none" w:sz="4" w:space="0" w:color="000000"/>
+              <w:top w:val="none" w:sz="6" w:space="0" w:color="000000"/>
+              <w:bottom w:val="none" w:sz="6" w:space="0" w:color="000000"/>
               <w:left w:val="none"/>
               <w:right w:val="none"/>
             </w:tcBorders>
           </w:tcPr>
           <w:p>
             <w:pPr>
-              <w:spacing w:before="40" w:after="40" w:line="240" w:lineRule="auto"/>
+              <w:spacing w:before="60" w:after="60" w:line="240" w:lineRule="auto"/>
             </w:pPr>
             <w:r/>
             <w:r>
@@ -1469,15 +1469,15 @@
           <w:tcPr>
             <w:tcW w:type="dxa" w:w="2340"/>
             <w:tcBorders>
-              <w:top w:val="none" w:sz="4" w:space="0" w:color="000000"/>
-              <w:bottom w:val="none" w:sz="4" w:space="0" w:color="000000"/>
+              <w:top w:val="none" w:sz="6" w:space="0" w:color="000000"/>
+              <w:bottom w:val="none" w:sz="6" w:space="0" w:color="000000"/>
               <w:left w:val="none"/>
               <w:right w:val="none"/>
             </w:tcBorders>
           </w:tcPr>
           <w:p>
             <w:pPr>
-              <w:spacing w:before="40" w:after="40" w:line="240" w:lineRule="auto"/>
+              <w:spacing w:before="60" w:after="60" w:line="240" w:lineRule="auto"/>
             </w:pPr>
             <w:r/>
             <w:r>
@@ -1496,15 +1496,15 @@
           <w:tcPr>
             <w:tcW w:type="dxa" w:w="2340"/>
             <w:tcBorders>
-              <w:top w:val="none" w:sz="4" w:space="0" w:color="000000"/>
-              <w:bottom w:val="none" w:sz="4" w:space="0" w:color="000000"/>
+              <w:top w:val="none" w:sz="6" w:space="0" w:color="000000"/>
+              <w:bottom w:val="none" w:sz="6" w:space="0" w:color="000000"/>
               <w:left w:val="none"/>
               <w:right w:val="none"/>
             </w:tcBorders>
           </w:tcPr>
           <w:p>
             <w:pPr>
-              <w:spacing w:before="40" w:after="40" w:line="240" w:lineRule="auto"/>
+              <w:spacing w:before="60" w:after="60" w:line="240" w:lineRule="auto"/>
             </w:pPr>
             <w:r/>
             <w:r>
@@ -1521,15 +1521,15 @@
           <w:tcPr>
             <w:tcW w:type="dxa" w:w="2340"/>
             <w:tcBorders>
-              <w:top w:val="none" w:sz="4" w:space="0" w:color="000000"/>
-              <w:bottom w:val="none" w:sz="4" w:space="0" w:color="000000"/>
+              <w:top w:val="none" w:sz="6" w:space="0" w:color="000000"/>
+              <w:bottom w:val="none" w:sz="6" w:space="0" w:color="000000"/>
               <w:left w:val="none"/>
               <w:right w:val="none"/>
             </w:tcBorders>
           </w:tcPr>
           <w:p>
             <w:pPr>
-              <w:spacing w:before="40" w:after="40" w:line="240" w:lineRule="auto"/>
+              <w:spacing w:before="60" w:after="60" w:line="240" w:lineRule="auto"/>
             </w:pPr>
             <w:r/>
             <w:r>
@@ -1546,15 +1546,15 @@
           <w:tcPr>
             <w:tcW w:type="dxa" w:w="2340"/>
             <w:tcBorders>
-              <w:top w:val="none" w:sz="4" w:space="0" w:color="000000"/>
-              <w:bottom w:val="none" w:sz="4" w:space="0" w:color="000000"/>
+              <w:top w:val="none" w:sz="6" w:space="0" w:color="000000"/>
+              <w:bottom w:val="none" w:sz="6" w:space="0" w:color="000000"/>
               <w:left w:val="none"/>
               <w:right w:val="none"/>
             </w:tcBorders>
           </w:tcPr>
           <w:p>
             <w:pPr>
-              <w:spacing w:before="40" w:after="40" w:line="240" w:lineRule="auto"/>
+              <w:spacing w:before="60" w:after="60" w:line="240" w:lineRule="auto"/>
             </w:pPr>
             <w:r/>
             <w:r>
@@ -1571,15 +1571,15 @@
           <w:tcPr>
             <w:tcW w:type="dxa" w:w="2340"/>
             <w:tcBorders>
-              <w:top w:val="none" w:sz="4" w:space="0" w:color="000000"/>
-              <w:bottom w:val="none" w:sz="4" w:space="0" w:color="000000"/>
+              <w:top w:val="none" w:sz="6" w:space="0" w:color="000000"/>
+              <w:bottom w:val="none" w:sz="6" w:space="0" w:color="000000"/>
               <w:left w:val="none"/>
               <w:right w:val="none"/>
             </w:tcBorders>
           </w:tcPr>
           <w:p>
             <w:pPr>
-              <w:spacing w:before="40" w:after="40" w:line="240" w:lineRule="auto"/>
+              <w:spacing w:before="60" w:after="60" w:line="240" w:lineRule="auto"/>
             </w:pPr>
             <w:r/>
             <w:r>
@@ -1598,15 +1598,15 @@
           <w:tcPr>
             <w:tcW w:type="dxa" w:w="2340"/>
             <w:tcBorders>
-              <w:top w:val="none" w:sz="4" w:space="0" w:color="000000"/>
-              <w:bottom w:val="none" w:sz="4" w:space="0" w:color="000000"/>
+              <w:top w:val="none" w:sz="6" w:space="0" w:color="000000"/>
+              <w:bottom w:val="none" w:sz="6" w:space="0" w:color="000000"/>
               <w:left w:val="none"/>
               <w:right w:val="none"/>
             </w:tcBorders>
           </w:tcPr>
           <w:p>
             <w:pPr>
-              <w:spacing w:before="40" w:after="40" w:line="240" w:lineRule="auto"/>
+              <w:spacing w:before="60" w:after="60" w:line="240" w:lineRule="auto"/>
             </w:pPr>
             <w:r/>
             <w:r>
@@ -1623,15 +1623,15 @@
           <w:tcPr>
             <w:tcW w:type="dxa" w:w="2340"/>
             <w:tcBorders>
-              <w:top w:val="none" w:sz="4" w:space="0" w:color="000000"/>
-              <w:bottom w:val="none" w:sz="4" w:space="0" w:color="000000"/>
+              <w:top w:val="none" w:sz="6" w:space="0" w:color="000000"/>
+              <w:bottom w:val="none" w:sz="6" w:space="0" w:color="000000"/>
               <w:left w:val="none"/>
               <w:right w:val="none"/>
             </w:tcBorders>
           </w:tcPr>
           <w:p>
             <w:pPr>
-              <w:spacing w:before="40" w:after="40" w:line="240" w:lineRule="auto"/>
+              <w:spacing w:before="60" w:after="60" w:line="240" w:lineRule="auto"/>
             </w:pPr>
             <w:r/>
             <w:r>
@@ -1648,15 +1648,15 @@
           <w:tcPr>
             <w:tcW w:type="dxa" w:w="2340"/>
             <w:tcBorders>
-              <w:top w:val="none" w:sz="4" w:space="0" w:color="000000"/>
-              <w:bottom w:val="none" w:sz="4" w:space="0" w:color="000000"/>
+              <w:top w:val="none" w:sz="6" w:space="0" w:color="000000"/>
+              <w:bottom w:val="none" w:sz="6" w:space="0" w:color="000000"/>
               <w:left w:val="none"/>
               <w:right w:val="none"/>
             </w:tcBorders>
           </w:tcPr>
           <w:p>
             <w:pPr>
-              <w:spacing w:before="40" w:after="40" w:line="240" w:lineRule="auto"/>
+              <w:spacing w:before="60" w:after="60" w:line="240" w:lineRule="auto"/>
             </w:pPr>
             <w:r/>
             <w:r>
@@ -1673,15 +1673,15 @@
           <w:tcPr>
             <w:tcW w:type="dxa" w:w="2340"/>
             <w:tcBorders>
-              <w:top w:val="none" w:sz="4" w:space="0" w:color="000000"/>
-              <w:bottom w:val="none" w:sz="4" w:space="0" w:color="000000"/>
+              <w:top w:val="none" w:sz="6" w:space="0" w:color="000000"/>
+              <w:bottom w:val="none" w:sz="6" w:space="0" w:color="000000"/>
               <w:left w:val="none"/>
               <w:right w:val="none"/>
             </w:tcBorders>
           </w:tcPr>
           <w:p>
             <w:pPr>
-              <w:spacing w:before="40" w:after="40" w:line="240" w:lineRule="auto"/>
+              <w:spacing w:before="60" w:after="60" w:line="240" w:lineRule="auto"/>
             </w:pPr>
             <w:r/>
             <w:r>
@@ -1700,15 +1700,15 @@
           <w:tcPr>
             <w:tcW w:type="dxa" w:w="2340"/>
             <w:tcBorders>
-              <w:top w:val="none" w:sz="4" w:space="0" w:color="000000"/>
-              <w:bottom w:val="none" w:sz="4" w:space="0" w:color="000000"/>
+              <w:top w:val="none" w:sz="6" w:space="0" w:color="000000"/>
+              <w:bottom w:val="none" w:sz="6" w:space="0" w:color="000000"/>
               <w:left w:val="none"/>
               <w:right w:val="none"/>
             </w:tcBorders>
           </w:tcPr>
           <w:p>
             <w:pPr>
-              <w:spacing w:before="40" w:after="40" w:line="240" w:lineRule="auto"/>
+              <w:spacing w:before="60" w:after="60" w:line="240" w:lineRule="auto"/>
             </w:pPr>
             <w:r/>
             <w:r>
@@ -1725,15 +1725,15 @@
           <w:tcPr>
             <w:tcW w:type="dxa" w:w="2340"/>
             <w:tcBorders>
-              <w:top w:val="none" w:sz="4" w:space="0" w:color="000000"/>
-              <w:bottom w:val="none" w:sz="4" w:space="0" w:color="000000"/>
+              <w:top w:val="none" w:sz="6" w:space="0" w:color="000000"/>
+              <w:bottom w:val="none" w:sz="6" w:space="0" w:color="000000"/>
               <w:left w:val="none"/>
               <w:right w:val="none"/>
             </w:tcBorders>
           </w:tcPr>
           <w:p>
             <w:pPr>
-              <w:spacing w:before="40" w:after="40" w:line="240" w:lineRule="auto"/>
+              <w:spacing w:before="60" w:after="60" w:line="240" w:lineRule="auto"/>
             </w:pPr>
             <w:r/>
             <w:r>
@@ -1750,15 +1750,15 @@
           <w:tcPr>
             <w:tcW w:type="dxa" w:w="2340"/>
             <w:tcBorders>
-              <w:top w:val="none" w:sz="4" w:space="0" w:color="000000"/>
-              <w:bottom w:val="none" w:sz="4" w:space="0" w:color="000000"/>
+              <w:top w:val="none" w:sz="6" w:space="0" w:color="000000"/>
+              <w:bottom w:val="none" w:sz="6" w:space="0" w:color="000000"/>
               <w:left w:val="none"/>
               <w:right w:val="none"/>
             </w:tcBorders>
           </w:tcPr>
           <w:p>
             <w:pPr>
-              <w:spacing w:before="40" w:after="40" w:line="240" w:lineRule="auto"/>
+              <w:spacing w:before="60" w:after="60" w:line="240" w:lineRule="auto"/>
             </w:pPr>
             <w:r/>
             <w:r>
@@ -1775,15 +1775,15 @@
           <w:tcPr>
             <w:tcW w:type="dxa" w:w="2340"/>
             <w:tcBorders>
-              <w:top w:val="none" w:sz="4" w:space="0" w:color="000000"/>
-              <w:bottom w:val="none" w:sz="4" w:space="0" w:color="000000"/>
+              <w:top w:val="none" w:sz="6" w:space="0" w:color="000000"/>
+              <w:bottom w:val="none" w:sz="6" w:space="0" w:color="000000"/>
               <w:left w:val="none"/>
               <w:right w:val="none"/>
             </w:tcBorders>
           </w:tcPr>
           <w:p>
             <w:pPr>
-              <w:spacing w:before="40" w:after="40" w:line="240" w:lineRule="auto"/>
+              <w:spacing w:before="60" w:after="60" w:line="240" w:lineRule="auto"/>
             </w:pPr>
             <w:r/>
             <w:r>
@@ -1802,15 +1802,15 @@
           <w:tcPr>
             <w:tcW w:type="dxa" w:w="2340"/>
             <w:tcBorders>
-              <w:top w:val="none" w:sz="4" w:space="0" w:color="000000"/>
-              <w:bottom w:val="none" w:sz="4" w:space="0" w:color="000000"/>
+              <w:top w:val="none" w:sz="6" w:space="0" w:color="000000"/>
+              <w:bottom w:val="none" w:sz="6" w:space="0" w:color="000000"/>
               <w:left w:val="none"/>
               <w:right w:val="none"/>
             </w:tcBorders>
           </w:tcPr>
           <w:p>
             <w:pPr>
-              <w:spacing w:before="40" w:after="40" w:line="240" w:lineRule="auto"/>
+              <w:spacing w:before="60" w:after="60" w:line="240" w:lineRule="auto"/>
             </w:pPr>
             <w:r/>
             <w:r>
@@ -1827,15 +1827,15 @@
           <w:tcPr>
             <w:tcW w:type="dxa" w:w="2340"/>
             <w:tcBorders>
-              <w:top w:val="none" w:sz="4" w:space="0" w:color="000000"/>
-              <w:bottom w:val="none" w:sz="4" w:space="0" w:color="000000"/>
+              <w:top w:val="none" w:sz="6" w:space="0" w:color="000000"/>
+              <w:bottom w:val="none" w:sz="6" w:space="0" w:color="000000"/>
               <w:left w:val="none"/>
               <w:right w:val="none"/>
             </w:tcBorders>
           </w:tcPr>
           <w:p>
             <w:pPr>
-              <w:spacing w:before="40" w:after="40" w:line="240" w:lineRule="auto"/>
+              <w:spacing w:before="60" w:after="60" w:line="240" w:lineRule="auto"/>
             </w:pPr>
             <w:r/>
             <w:r>
@@ -1852,15 +1852,15 @@
           <w:tcPr>
             <w:tcW w:type="dxa" w:w="2340"/>
             <w:tcBorders>
-              <w:top w:val="none" w:sz="4" w:space="0" w:color="000000"/>
-              <w:bottom w:val="none" w:sz="4" w:space="0" w:color="000000"/>
+              <w:top w:val="none" w:sz="6" w:space="0" w:color="000000"/>
+              <w:bottom w:val="none" w:sz="6" w:space="0" w:color="000000"/>
               <w:left w:val="none"/>
               <w:right w:val="none"/>
             </w:tcBorders>
           </w:tcPr>
           <w:p>
             <w:pPr>
-              <w:spacing w:before="40" w:after="40" w:line="240" w:lineRule="auto"/>
+              <w:spacing w:before="60" w:after="60" w:line="240" w:lineRule="auto"/>
             </w:pPr>
             <w:r/>
             <w:r>
@@ -1877,15 +1877,15 @@
           <w:tcPr>
             <w:tcW w:type="dxa" w:w="2340"/>
             <w:tcBorders>
-              <w:top w:val="none" w:sz="4" w:space="0" w:color="000000"/>
-              <w:bottom w:val="none" w:sz="4" w:space="0" w:color="000000"/>
+              <w:top w:val="none" w:sz="6" w:space="0" w:color="000000"/>
+              <w:bottom w:val="none" w:sz="6" w:space="0" w:color="000000"/>
               <w:left w:val="none"/>
               <w:right w:val="none"/>
             </w:tcBorders>
           </w:tcPr>
           <w:p>
             <w:pPr>
-              <w:spacing w:before="40" w:after="40" w:line="240" w:lineRule="auto"/>
+              <w:spacing w:before="60" w:after="60" w:line="240" w:lineRule="auto"/>
             </w:pPr>
             <w:r/>
             <w:r>
@@ -1904,15 +1904,15 @@
           <w:tcPr>
             <w:tcW w:type="dxa" w:w="2340"/>
             <w:tcBorders>
-              <w:top w:val="none" w:sz="4" w:space="0" w:color="000000"/>
-              <w:bottom w:val="none" w:sz="4" w:space="0" w:color="000000"/>
+              <w:top w:val="none" w:sz="6" w:space="0" w:color="000000"/>
+              <w:bottom w:val="none" w:sz="6" w:space="0" w:color="000000"/>
               <w:left w:val="none"/>
               <w:right w:val="none"/>
             </w:tcBorders>
           </w:tcPr>
           <w:p>
             <w:pPr>
-              <w:spacing w:before="40" w:after="40" w:line="240" w:lineRule="auto"/>
+              <w:spacing w:before="60" w:after="60" w:line="240" w:lineRule="auto"/>
             </w:pPr>
             <w:r/>
             <w:r>
@@ -1929,15 +1929,15 @@
           <w:tcPr>
             <w:tcW w:type="dxa" w:w="2340"/>
             <w:tcBorders>
-              <w:top w:val="none" w:sz="4" w:space="0" w:color="000000"/>
-              <w:bottom w:val="none" w:sz="4" w:space="0" w:color="000000"/>
+              <w:top w:val="none" w:sz="6" w:space="0" w:color="000000"/>
+              <w:bottom w:val="none" w:sz="6" w:space="0" w:color="000000"/>
               <w:left w:val="none"/>
               <w:right w:val="none"/>
             </w:tcBorders>
           </w:tcPr>
           <w:p>
             <w:pPr>
-              <w:spacing w:before="40" w:after="40" w:line="240" w:lineRule="auto"/>
+              <w:spacing w:before="60" w:after="60" w:line="240" w:lineRule="auto"/>
             </w:pPr>
             <w:r/>
             <w:r>
@@ -1954,15 +1954,15 @@
           <w:tcPr>
             <w:tcW w:type="dxa" w:w="2340"/>
             <w:tcBorders>
-              <w:top w:val="none" w:sz="4" w:space="0" w:color="000000"/>
-              <w:bottom w:val="none" w:sz="4" w:space="0" w:color="000000"/>
+              <w:top w:val="none" w:sz="6" w:space="0" w:color="000000"/>
+              <w:bottom w:val="none" w:sz="6" w:space="0" w:color="000000"/>
               <w:left w:val="none"/>
               <w:right w:val="none"/>
             </w:tcBorders>
           </w:tcPr>
           <w:p>
             <w:pPr>
-              <w:spacing w:before="40" w:after="40" w:line="240" w:lineRule="auto"/>
+              <w:spacing w:before="60" w:after="60" w:line="240" w:lineRule="auto"/>
             </w:pPr>
             <w:r/>
             <w:r>
@@ -1979,15 +1979,15 @@
           <w:tcPr>
             <w:tcW w:type="dxa" w:w="2340"/>
             <w:tcBorders>
-              <w:top w:val="none" w:sz="4" w:space="0" w:color="000000"/>
-              <w:bottom w:val="none" w:sz="4" w:space="0" w:color="000000"/>
+              <w:top w:val="none" w:sz="6" w:space="0" w:color="000000"/>
+              <w:bottom w:val="none" w:sz="6" w:space="0" w:color="000000"/>
               <w:left w:val="none"/>
               <w:right w:val="none"/>
             </w:tcBorders>
           </w:tcPr>
           <w:p>
             <w:pPr>
-              <w:spacing w:before="40" w:after="40" w:line="240" w:lineRule="auto"/>
+              <w:spacing w:before="60" w:after="60" w:line="240" w:lineRule="auto"/>
             </w:pPr>
             <w:r/>
             <w:r>
@@ -2006,15 +2006,15 @@
           <w:tcPr>
             <w:tcW w:type="dxa" w:w="2340"/>
             <w:tcBorders>
-              <w:top w:val="none" w:sz="4" w:space="0" w:color="000000"/>
-              <w:bottom w:val="single" w:sz="4" w:space="0" w:color="000000"/>
+              <w:top w:val="none" w:sz="6" w:space="0" w:color="000000"/>
+              <w:bottom w:val="single" w:sz="6" w:space="0" w:color="000000"/>
               <w:left w:val="none"/>
               <w:right w:val="none"/>
             </w:tcBorders>
           </w:tcPr>
           <w:p>
             <w:pPr>
-              <w:spacing w:before="40" w:after="40" w:line="240" w:lineRule="auto"/>
+              <w:spacing w:before="60" w:after="60" w:line="240" w:lineRule="auto"/>
             </w:pPr>
             <w:r/>
             <w:r>
@@ -2031,15 +2031,15 @@
           <w:tcPr>
             <w:tcW w:type="dxa" w:w="2340"/>
             <w:tcBorders>
-              <w:top w:val="none" w:sz="4" w:space="0" w:color="000000"/>
-              <w:bottom w:val="single" w:sz="4" w:space="0" w:color="000000"/>
+              <w:top w:val="none" w:sz="6" w:space="0" w:color="000000"/>
+              <w:bottom w:val="single" w:sz="6" w:space="0" w:color="000000"/>
               <w:left w:val="none"/>
               <w:right w:val="none"/>
             </w:tcBorders>
           </w:tcPr>
           <w:p>
             <w:pPr>
-              <w:spacing w:before="40" w:after="40" w:line="240" w:lineRule="auto"/>
+              <w:spacing w:before="60" w:after="60" w:line="240" w:lineRule="auto"/>
             </w:pPr>
             <w:r/>
             <w:r>
@@ -2056,15 +2056,15 @@
           <w:tcPr>
             <w:tcW w:type="dxa" w:w="2340"/>
             <w:tcBorders>
-              <w:top w:val="none" w:sz="4" w:space="0" w:color="000000"/>
-              <w:bottom w:val="single" w:sz="4" w:space="0" w:color="000000"/>
+              <w:top w:val="none" w:sz="6" w:space="0" w:color="000000"/>
+              <w:bottom w:val="single" w:sz="6" w:space="0" w:color="000000"/>
               <w:left w:val="none"/>
               <w:right w:val="none"/>
             </w:tcBorders>
           </w:tcPr>
           <w:p>
             <w:pPr>
-              <w:spacing w:before="40" w:after="40" w:line="240" w:lineRule="auto"/>
+              <w:spacing w:before="60" w:after="60" w:line="240" w:lineRule="auto"/>
             </w:pPr>
             <w:r/>
             <w:r>
@@ -2081,15 +2081,15 @@
           <w:tcPr>
             <w:tcW w:type="dxa" w:w="2340"/>
             <w:tcBorders>
-              <w:top w:val="none" w:sz="4" w:space="0" w:color="000000"/>
-              <w:bottom w:val="single" w:sz="4" w:space="0" w:color="000000"/>
+              <w:top w:val="none" w:sz="6" w:space="0" w:color="000000"/>
+              <w:bottom w:val="single" w:sz="6" w:space="0" w:color="000000"/>
               <w:left w:val="none"/>
               <w:right w:val="none"/>
             </w:tcBorders>
           </w:tcPr>
           <w:p>
             <w:pPr>
-              <w:spacing w:before="40" w:after="40" w:line="240" w:lineRule="auto"/>
+              <w:spacing w:before="60" w:after="60" w:line="240" w:lineRule="auto"/>
             </w:pPr>
             <w:r/>
             <w:r>
@@ -2107,7 +2107,7 @@
     <w:p>
       <w:pPr>
         <w:spacing w:before="0" w:after="120" w:line="276" w:lineRule="auto"/>
-        <w:jc w:val="left"/>
+        <w:jc w:val="both"/>
       </w:pPr>
     </w:p>
     <w:p>
@@ -2157,7 +2157,7 @@
     </w:p>
     <w:p>
       <w:pPr>
-        <w:spacing w:before="40" w:after="80" w:line="276" w:lineRule="auto"/>
+        <w:spacing w:before="0" w:after="120" w:line="276" w:lineRule="auto"/>
         <w:jc w:val="both"/>
       </w:pPr>
       <w:r>
@@ -2172,7 +2172,7 @@
     </w:p>
     <w:p>
       <w:pPr>
-        <w:spacing w:before="40" w:after="80" w:line="276" w:lineRule="auto"/>
+        <w:spacing w:before="0" w:after="120" w:line="276" w:lineRule="auto"/>
         <w:jc w:val="both"/>
       </w:pPr>
       <w:r>
@@ -2187,7 +2187,7 @@
     </w:p>
     <w:p>
       <w:pPr>
-        <w:spacing w:before="40" w:after="80" w:line="276" w:lineRule="auto"/>
+        <w:spacing w:before="0" w:after="120" w:line="276" w:lineRule="auto"/>
         <w:jc w:val="both"/>
       </w:pPr>
       <w:r>
@@ -2202,7 +2202,7 @@
     </w:p>
     <w:p>
       <w:pPr>
-        <w:spacing w:before="40" w:after="80" w:line="276" w:lineRule="auto"/>
+        <w:spacing w:before="0" w:after="120" w:line="276" w:lineRule="auto"/>
         <w:jc w:val="both"/>
       </w:pPr>
       <w:r>
@@ -2217,7 +2217,7 @@
     </w:p>
     <w:p>
       <w:pPr>
-        <w:spacing w:before="40" w:after="80" w:line="276" w:lineRule="auto"/>
+        <w:spacing w:before="0" w:after="120" w:line="276" w:lineRule="auto"/>
         <w:jc w:val="both"/>
       </w:pPr>
       <w:r>
@@ -2262,7 +2262,7 @@
     </w:p>
     <w:p>
       <w:pPr>
-        <w:spacing w:before="160" w:after="80" w:line="276" w:lineRule="auto"/>
+        <w:spacing w:before="200" w:after="80" w:line="276" w:lineRule="auto"/>
         <w:jc w:val="left"/>
       </w:pPr>
       <w:r>
@@ -2294,15 +2294,15 @@
           <w:tcPr>
             <w:tcW w:type="dxa" w:w="1872"/>
             <w:tcBorders>
-              <w:top w:val="single" w:sz="4" w:space="0" w:color="000000"/>
-              <w:bottom w:val="single" w:sz="4" w:space="0" w:color="000000"/>
+              <w:top w:val="single" w:sz="6" w:space="0" w:color="000000"/>
+              <w:bottom w:val="single" w:sz="6" w:space="0" w:color="000000"/>
               <w:left w:val="none"/>
               <w:right w:val="none"/>
             </w:tcBorders>
           </w:tcPr>
           <w:p>
             <w:pPr>
-              <w:spacing w:before="40" w:after="40" w:line="240" w:lineRule="auto"/>
+              <w:spacing w:before="60" w:after="60" w:line="240" w:lineRule="auto"/>
             </w:pPr>
             <w:r/>
             <w:r>
@@ -2319,15 +2319,15 @@
           <w:tcPr>
             <w:tcW w:type="dxa" w:w="1872"/>
             <w:tcBorders>
-              <w:top w:val="single" w:sz="4" w:space="0" w:color="000000"/>
-              <w:bottom w:val="single" w:sz="4" w:space="0" w:color="000000"/>
+              <w:top w:val="single" w:sz="6" w:space="0" w:color="000000"/>
+              <w:bottom w:val="single" w:sz="6" w:space="0" w:color="000000"/>
               <w:left w:val="none"/>
               <w:right w:val="none"/>
             </w:tcBorders>
           </w:tcPr>
           <w:p>
             <w:pPr>
-              <w:spacing w:before="40" w:after="40" w:line="240" w:lineRule="auto"/>
+              <w:spacing w:before="60" w:after="60" w:line="240" w:lineRule="auto"/>
             </w:pPr>
             <w:r/>
             <w:r>
@@ -2344,15 +2344,15 @@
           <w:tcPr>
             <w:tcW w:type="dxa" w:w="1872"/>
             <w:tcBorders>
-              <w:top w:val="single" w:sz="4" w:space="0" w:color="000000"/>
-              <w:bottom w:val="single" w:sz="4" w:space="0" w:color="000000"/>
+              <w:top w:val="single" w:sz="6" w:space="0" w:color="000000"/>
+              <w:bottom w:val="single" w:sz="6" w:space="0" w:color="000000"/>
               <w:left w:val="none"/>
               <w:right w:val="none"/>
             </w:tcBorders>
           </w:tcPr>
           <w:p>
             <w:pPr>
-              <w:spacing w:before="40" w:after="40" w:line="240" w:lineRule="auto"/>
+              <w:spacing w:before="60" w:after="60" w:line="240" w:lineRule="auto"/>
             </w:pPr>
             <w:r/>
             <w:r>
@@ -2369,15 +2369,15 @@
           <w:tcPr>
             <w:tcW w:type="dxa" w:w="1872"/>
             <w:tcBorders>
-              <w:top w:val="single" w:sz="4" w:space="0" w:color="000000"/>
-              <w:bottom w:val="single" w:sz="4" w:space="0" w:color="000000"/>
+              <w:top w:val="single" w:sz="6" w:space="0" w:color="000000"/>
+              <w:bottom w:val="single" w:sz="6" w:space="0" w:color="000000"/>
               <w:left w:val="none"/>
               <w:right w:val="none"/>
             </w:tcBorders>
           </w:tcPr>
           <w:p>
             <w:pPr>
-              <w:spacing w:before="40" w:after="40" w:line="240" w:lineRule="auto"/>
+              <w:spacing w:before="60" w:after="60" w:line="240" w:lineRule="auto"/>
             </w:pPr>
             <w:r/>
             <w:r>
@@ -2394,15 +2394,15 @@
           <w:tcPr>
             <w:tcW w:type="dxa" w:w="1872"/>
             <w:tcBorders>
-              <w:top w:val="single" w:sz="4" w:space="0" w:color="000000"/>
-              <w:bottom w:val="single" w:sz="4" w:space="0" w:color="000000"/>
+              <w:top w:val="single" w:sz="6" w:space="0" w:color="000000"/>
+              <w:bottom w:val="single" w:sz="6" w:space="0" w:color="000000"/>
               <w:left w:val="none"/>
               <w:right w:val="none"/>
             </w:tcBorders>
           </w:tcPr>
           <w:p>
             <w:pPr>
-              <w:spacing w:before="40" w:after="40" w:line="240" w:lineRule="auto"/>
+              <w:spacing w:before="60" w:after="60" w:line="240" w:lineRule="auto"/>
             </w:pPr>
             <w:r/>
             <w:r>
@@ -2421,15 +2421,15 @@
           <w:tcPr>
             <w:tcW w:type="dxa" w:w="1872"/>
             <w:tcBorders>
-              <w:top w:val="none" w:sz="4" w:space="0" w:color="000000"/>
-              <w:bottom w:val="none" w:sz="4" w:space="0" w:color="000000"/>
+              <w:top w:val="none" w:sz="6" w:space="0" w:color="000000"/>
+              <w:bottom w:val="none" w:sz="6" w:space="0" w:color="000000"/>
               <w:left w:val="none"/>
               <w:right w:val="none"/>
             </w:tcBorders>
           </w:tcPr>
           <w:p>
             <w:pPr>
-              <w:spacing w:before="40" w:after="40" w:line="240" w:lineRule="auto"/>
+              <w:spacing w:before="60" w:after="60" w:line="240" w:lineRule="auto"/>
             </w:pPr>
             <w:r/>
             <w:r>
@@ -2446,15 +2446,15 @@
           <w:tcPr>
             <w:tcW w:type="dxa" w:w="1872"/>
             <w:tcBorders>
-              <w:top w:val="none" w:sz="4" w:space="0" w:color="000000"/>
-              <w:bottom w:val="none" w:sz="4" w:space="0" w:color="000000"/>
+              <w:top w:val="none" w:sz="6" w:space="0" w:color="000000"/>
+              <w:bottom w:val="none" w:sz="6" w:space="0" w:color="000000"/>
               <w:left w:val="none"/>
               <w:right w:val="none"/>
             </w:tcBorders>
           </w:tcPr>
           <w:p>
             <w:pPr>
-              <w:spacing w:before="40" w:after="40" w:line="240" w:lineRule="auto"/>
+              <w:spacing w:before="60" w:after="60" w:line="240" w:lineRule="auto"/>
             </w:pPr>
             <w:r/>
             <w:r>
@@ -2471,15 +2471,15 @@
           <w:tcPr>
             <w:tcW w:type="dxa" w:w="1872"/>
             <w:tcBorders>
-              <w:top w:val="none" w:sz="4" w:space="0" w:color="000000"/>
-              <w:bottom w:val="none" w:sz="4" w:space="0" w:color="000000"/>
+              <w:top w:val="none" w:sz="6" w:space="0" w:color="000000"/>
+              <w:bottom w:val="none" w:sz="6" w:space="0" w:color="000000"/>
               <w:left w:val="none"/>
               <w:right w:val="none"/>
             </w:tcBorders>
           </w:tcPr>
           <w:p>
             <w:pPr>
-              <w:spacing w:before="40" w:after="40" w:line="240" w:lineRule="auto"/>
+              <w:spacing w:before="60" w:after="60" w:line="240" w:lineRule="auto"/>
             </w:pPr>
             <w:r/>
             <w:r>
@@ -2496,15 +2496,15 @@
           <w:tcPr>
             <w:tcW w:type="dxa" w:w="1872"/>
             <w:tcBorders>
-              <w:top w:val="none" w:sz="4" w:space="0" w:color="000000"/>
-              <w:bottom w:val="none" w:sz="4" w:space="0" w:color="000000"/>
+              <w:top w:val="none" w:sz="6" w:space="0" w:color="000000"/>
+              <w:bottom w:val="none" w:sz="6" w:space="0" w:color="000000"/>
               <w:left w:val="none"/>
               <w:right w:val="none"/>
             </w:tcBorders>
           </w:tcPr>
           <w:p>
             <w:pPr>
-              <w:spacing w:before="40" w:after="40" w:line="240" w:lineRule="auto"/>
+              <w:spacing w:before="60" w:after="60" w:line="240" w:lineRule="auto"/>
             </w:pPr>
             <w:r/>
             <w:r>
@@ -2521,15 +2521,15 @@
           <w:tcPr>
             <w:tcW w:type="dxa" w:w="1872"/>
             <w:tcBorders>
-              <w:top w:val="none" w:sz="4" w:space="0" w:color="000000"/>
-              <w:bottom w:val="none" w:sz="4" w:space="0" w:color="000000"/>
+              <w:top w:val="none" w:sz="6" w:space="0" w:color="000000"/>
+              <w:bottom w:val="none" w:sz="6" w:space="0" w:color="000000"/>
               <w:left w:val="none"/>
               <w:right w:val="none"/>
             </w:tcBorders>
           </w:tcPr>
           <w:p>
             <w:pPr>
-              <w:spacing w:before="40" w:after="40" w:line="240" w:lineRule="auto"/>
+              <w:spacing w:before="60" w:after="60" w:line="240" w:lineRule="auto"/>
             </w:pPr>
             <w:r/>
             <w:r>
@@ -2548,15 +2548,15 @@
           <w:tcPr>
             <w:tcW w:type="dxa" w:w="1872"/>
             <w:tcBorders>
-              <w:top w:val="none" w:sz="4" w:space="0" w:color="000000"/>
-              <w:bottom w:val="none" w:sz="4" w:space="0" w:color="000000"/>
+              <w:top w:val="none" w:sz="6" w:space="0" w:color="000000"/>
+              <w:bottom w:val="none" w:sz="6" w:space="0" w:color="000000"/>
               <w:left w:val="none"/>
               <w:right w:val="none"/>
             </w:tcBorders>
           </w:tcPr>
           <w:p>
             <w:pPr>
-              <w:spacing w:before="40" w:after="40" w:line="240" w:lineRule="auto"/>
+              <w:spacing w:before="60" w:after="60" w:line="240" w:lineRule="auto"/>
             </w:pPr>
             <w:r/>
             <w:r>
@@ -2573,15 +2573,15 @@
           <w:tcPr>
             <w:tcW w:type="dxa" w:w="1872"/>
             <w:tcBorders>
-              <w:top w:val="none" w:sz="4" w:space="0" w:color="000000"/>
-              <w:bottom w:val="none" w:sz="4" w:space="0" w:color="000000"/>
+              <w:top w:val="none" w:sz="6" w:space="0" w:color="000000"/>
+              <w:bottom w:val="none" w:sz="6" w:space="0" w:color="000000"/>
               <w:left w:val="none"/>
               <w:right w:val="none"/>
             </w:tcBorders>
           </w:tcPr>
           <w:p>
             <w:pPr>
-              <w:spacing w:before="40" w:after="40" w:line="240" w:lineRule="auto"/>
+              <w:spacing w:before="60" w:after="60" w:line="240" w:lineRule="auto"/>
             </w:pPr>
             <w:r/>
             <w:r>
@@ -2598,15 +2598,15 @@
           <w:tcPr>
             <w:tcW w:type="dxa" w:w="1872"/>
             <w:tcBorders>
-              <w:top w:val="none" w:sz="4" w:space="0" w:color="000000"/>
-              <w:bottom w:val="none" w:sz="4" w:space="0" w:color="000000"/>
+              <w:top w:val="none" w:sz="6" w:space="0" w:color="000000"/>
+              <w:bottom w:val="none" w:sz="6" w:space="0" w:color="000000"/>
               <w:left w:val="none"/>
               <w:right w:val="none"/>
             </w:tcBorders>
           </w:tcPr>
           <w:p>
             <w:pPr>
-              <w:spacing w:before="40" w:after="40" w:line="240" w:lineRule="auto"/>
+              <w:spacing w:before="60" w:after="60" w:line="240" w:lineRule="auto"/>
             </w:pPr>
             <w:r/>
             <w:r>
@@ -2623,15 +2623,15 @@
           <w:tcPr>
             <w:tcW w:type="dxa" w:w="1872"/>
             <w:tcBorders>
-              <w:top w:val="none" w:sz="4" w:space="0" w:color="000000"/>
-              <w:bottom w:val="none" w:sz="4" w:space="0" w:color="000000"/>
+              <w:top w:val="none" w:sz="6" w:space="0" w:color="000000"/>
+              <w:bottom w:val="none" w:sz="6" w:space="0" w:color="000000"/>
               <w:left w:val="none"/>
               <w:right w:val="none"/>
             </w:tcBorders>
           </w:tcPr>
           <w:p>
             <w:pPr>
-              <w:spacing w:before="40" w:after="40" w:line="240" w:lineRule="auto"/>
+              <w:spacing w:before="60" w:after="60" w:line="240" w:lineRule="auto"/>
             </w:pPr>
             <w:r/>
             <w:r>
@@ -2648,15 +2648,15 @@
           <w:tcPr>
             <w:tcW w:type="dxa" w:w="1872"/>
             <w:tcBorders>
-              <w:top w:val="none" w:sz="4" w:space="0" w:color="000000"/>
-              <w:bottom w:val="none" w:sz="4" w:space="0" w:color="000000"/>
+              <w:top w:val="none" w:sz="6" w:space="0" w:color="000000"/>
+              <w:bottom w:val="none" w:sz="6" w:space="0" w:color="000000"/>
               <w:left w:val="none"/>
               <w:right w:val="none"/>
             </w:tcBorders>
           </w:tcPr>
           <w:p>
             <w:pPr>
-              <w:spacing w:before="40" w:after="40" w:line="240" w:lineRule="auto"/>
+              <w:spacing w:before="60" w:after="60" w:line="240" w:lineRule="auto"/>
             </w:pPr>
             <w:r/>
             <w:r>
@@ -2675,15 +2675,15 @@
           <w:tcPr>
             <w:tcW w:type="dxa" w:w="1872"/>
             <w:tcBorders>
-              <w:top w:val="none" w:sz="4" w:space="0" w:color="000000"/>
-              <w:bottom w:val="none" w:sz="4" w:space="0" w:color="000000"/>
+              <w:top w:val="none" w:sz="6" w:space="0" w:color="000000"/>
+              <w:bottom w:val="none" w:sz="6" w:space="0" w:color="000000"/>
               <w:left w:val="none"/>
               <w:right w:val="none"/>
             </w:tcBorders>
           </w:tcPr>
           <w:p>
             <w:pPr>
-              <w:spacing w:before="40" w:after="40" w:line="240" w:lineRule="auto"/>
+              <w:spacing w:before="60" w:after="60" w:line="240" w:lineRule="auto"/>
             </w:pPr>
             <w:r/>
             <w:r>
@@ -2700,15 +2700,15 @@
           <w:tcPr>
             <w:tcW w:type="dxa" w:w="1872"/>
             <w:tcBorders>
-              <w:top w:val="none" w:sz="4" w:space="0" w:color="000000"/>
-              <w:bottom w:val="none" w:sz="4" w:space="0" w:color="000000"/>
+              <w:top w:val="none" w:sz="6" w:space="0" w:color="000000"/>
+              <w:bottom w:val="none" w:sz="6" w:space="0" w:color="000000"/>
               <w:left w:val="none"/>
               <w:right w:val="none"/>
             </w:tcBorders>
           </w:tcPr>
           <w:p>
             <w:pPr>
-              <w:spacing w:before="40" w:after="40" w:line="240" w:lineRule="auto"/>
+              <w:spacing w:before="60" w:after="60" w:line="240" w:lineRule="auto"/>
             </w:pPr>
             <w:r/>
             <w:r>
@@ -2725,15 +2725,15 @@
           <w:tcPr>
             <w:tcW w:type="dxa" w:w="1872"/>
             <w:tcBorders>
-              <w:top w:val="none" w:sz="4" w:space="0" w:color="000000"/>
-              <w:bottom w:val="none" w:sz="4" w:space="0" w:color="000000"/>
+              <w:top w:val="none" w:sz="6" w:space="0" w:color="000000"/>
+              <w:bottom w:val="none" w:sz="6" w:space="0" w:color="000000"/>
               <w:left w:val="none"/>
               <w:right w:val="none"/>
             </w:tcBorders>
           </w:tcPr>
           <w:p>
             <w:pPr>
-              <w:spacing w:before="40" w:after="40" w:line="240" w:lineRule="auto"/>
+              <w:spacing w:before="60" w:after="60" w:line="240" w:lineRule="auto"/>
             </w:pPr>
             <w:r/>
             <w:r>
@@ -2750,15 +2750,15 @@
           <w:tcPr>
             <w:tcW w:type="dxa" w:w="1872"/>
             <w:tcBorders>
-              <w:top w:val="none" w:sz="4" w:space="0" w:color="000000"/>
-              <w:bottom w:val="none" w:sz="4" w:space="0" w:color="000000"/>
+              <w:top w:val="none" w:sz="6" w:space="0" w:color="000000"/>
+              <w:bottom w:val="none" w:sz="6" w:space="0" w:color="000000"/>
               <w:left w:val="none"/>
               <w:right w:val="none"/>
             </w:tcBorders>
           </w:tcPr>
           <w:p>
             <w:pPr>
-              <w:spacing w:before="40" w:after="40" w:line="240" w:lineRule="auto"/>
+              <w:spacing w:before="60" w:after="60" w:line="240" w:lineRule="auto"/>
             </w:pPr>
             <w:r/>
             <w:r>
@@ -2775,15 +2775,15 @@
           <w:tcPr>
             <w:tcW w:type="dxa" w:w="1872"/>
             <w:tcBorders>
-              <w:top w:val="none" w:sz="4" w:space="0" w:color="000000"/>
-              <w:bottom w:val="none" w:sz="4" w:space="0" w:color="000000"/>
+              <w:top w:val="none" w:sz="6" w:space="0" w:color="000000"/>
+              <w:bottom w:val="none" w:sz="6" w:space="0" w:color="000000"/>
               <w:left w:val="none"/>
               <w:right w:val="none"/>
             </w:tcBorders>
           </w:tcPr>
           <w:p>
             <w:pPr>
-              <w:spacing w:before="40" w:after="40" w:line="240" w:lineRule="auto"/>
+              <w:spacing w:before="60" w:after="60" w:line="240" w:lineRule="auto"/>
             </w:pPr>
             <w:r/>
             <w:r>
@@ -2802,15 +2802,15 @@
           <w:tcPr>
             <w:tcW w:type="dxa" w:w="1872"/>
             <w:tcBorders>
-              <w:top w:val="none" w:sz="4" w:space="0" w:color="000000"/>
-              <w:bottom w:val="none" w:sz="4" w:space="0" w:color="000000"/>
+              <w:top w:val="none" w:sz="6" w:space="0" w:color="000000"/>
+              <w:bottom w:val="none" w:sz="6" w:space="0" w:color="000000"/>
               <w:left w:val="none"/>
               <w:right w:val="none"/>
             </w:tcBorders>
           </w:tcPr>
           <w:p>
             <w:pPr>
-              <w:spacing w:before="40" w:after="40" w:line="240" w:lineRule="auto"/>
+              <w:spacing w:before="60" w:after="60" w:line="240" w:lineRule="auto"/>
             </w:pPr>
             <w:r/>
             <w:r>
@@ -2827,15 +2827,15 @@
           <w:tcPr>
             <w:tcW w:type="dxa" w:w="1872"/>
             <w:tcBorders>
-              <w:top w:val="none" w:sz="4" w:space="0" w:color="000000"/>
-              <w:bottom w:val="none" w:sz="4" w:space="0" w:color="000000"/>
+              <w:top w:val="none" w:sz="6" w:space="0" w:color="000000"/>
+              <w:bottom w:val="none" w:sz="6" w:space="0" w:color="000000"/>
               <w:left w:val="none"/>
               <w:right w:val="none"/>
             </w:tcBorders>
           </w:tcPr>
           <w:p>
             <w:pPr>
-              <w:spacing w:before="40" w:after="40" w:line="240" w:lineRule="auto"/>
+              <w:spacing w:before="60" w:after="60" w:line="240" w:lineRule="auto"/>
             </w:pPr>
             <w:r/>
             <w:r>
@@ -2852,15 +2852,15 @@
           <w:tcPr>
             <w:tcW w:type="dxa" w:w="1872"/>
             <w:tcBorders>
-              <w:top w:val="none" w:sz="4" w:space="0" w:color="000000"/>
-              <w:bottom w:val="none" w:sz="4" w:space="0" w:color="000000"/>
+              <w:top w:val="none" w:sz="6" w:space="0" w:color="000000"/>
+              <w:bottom w:val="none" w:sz="6" w:space="0" w:color="000000"/>
               <w:left w:val="none"/>
               <w:right w:val="none"/>
             </w:tcBorders>
           </w:tcPr>
           <w:p>
             <w:pPr>
-              <w:spacing w:before="40" w:after="40" w:line="240" w:lineRule="auto"/>
+              <w:spacing w:before="60" w:after="60" w:line="240" w:lineRule="auto"/>
             </w:pPr>
             <w:r/>
             <w:r>
@@ -2877,15 +2877,15 @@
           <w:tcPr>
             <w:tcW w:type="dxa" w:w="1872"/>
             <w:tcBorders>
-              <w:top w:val="none" w:sz="4" w:space="0" w:color="000000"/>
-              <w:bottom w:val="none" w:sz="4" w:space="0" w:color="000000"/>
+              <w:top w:val="none" w:sz="6" w:space="0" w:color="000000"/>
+              <w:bottom w:val="none" w:sz="6" w:space="0" w:color="000000"/>
               <w:left w:val="none"/>
               <w:right w:val="none"/>
             </w:tcBorders>
           </w:tcPr>
           <w:p>
             <w:pPr>
-              <w:spacing w:before="40" w:after="40" w:line="240" w:lineRule="auto"/>
+              <w:spacing w:before="60" w:after="60" w:line="240" w:lineRule="auto"/>
             </w:pPr>
             <w:r/>
             <w:r>
@@ -2902,15 +2902,15 @@
           <w:tcPr>
             <w:tcW w:type="dxa" w:w="1872"/>
             <w:tcBorders>
-              <w:top w:val="none" w:sz="4" w:space="0" w:color="000000"/>
-              <w:bottom w:val="none" w:sz="4" w:space="0" w:color="000000"/>
+              <w:top w:val="none" w:sz="6" w:space="0" w:color="000000"/>
+              <w:bottom w:val="none" w:sz="6" w:space="0" w:color="000000"/>
               <w:left w:val="none"/>
               <w:right w:val="none"/>
             </w:tcBorders>
           </w:tcPr>
           <w:p>
             <w:pPr>
-              <w:spacing w:before="40" w:after="40" w:line="240" w:lineRule="auto"/>
+              <w:spacing w:before="60" w:after="60" w:line="240" w:lineRule="auto"/>
             </w:pPr>
             <w:r/>
             <w:r>
@@ -2929,15 +2929,15 @@
           <w:tcPr>
             <w:tcW w:type="dxa" w:w="1872"/>
             <w:tcBorders>
-              <w:top w:val="none" w:sz="4" w:space="0" w:color="000000"/>
-              <w:bottom w:val="none" w:sz="4" w:space="0" w:color="000000"/>
+              <w:top w:val="none" w:sz="6" w:space="0" w:color="000000"/>
+              <w:bottom w:val="none" w:sz="6" w:space="0" w:color="000000"/>
               <w:left w:val="none"/>
               <w:right w:val="none"/>
             </w:tcBorders>
           </w:tcPr>
           <w:p>
             <w:pPr>
-              <w:spacing w:before="40" w:after="40" w:line="240" w:lineRule="auto"/>
+              <w:spacing w:before="60" w:after="60" w:line="240" w:lineRule="auto"/>
             </w:pPr>
             <w:r/>
             <w:r>
@@ -2954,15 +2954,15 @@
           <w:tcPr>
             <w:tcW w:type="dxa" w:w="1872"/>
             <w:tcBorders>
-              <w:top w:val="none" w:sz="4" w:space="0" w:color="000000"/>
-              <w:bottom w:val="none" w:sz="4" w:space="0" w:color="000000"/>
+              <w:top w:val="none" w:sz="6" w:space="0" w:color="000000"/>
+              <w:bottom w:val="none" w:sz="6" w:space="0" w:color="000000"/>
               <w:left w:val="none"/>
               <w:right w:val="none"/>
             </w:tcBorders>
           </w:tcPr>
           <w:p>
             <w:pPr>
-              <w:spacing w:before="40" w:after="40" w:line="240" w:lineRule="auto"/>
+              <w:spacing w:before="60" w:after="60" w:line="240" w:lineRule="auto"/>
             </w:pPr>
             <w:r/>
             <w:r>
@@ -2979,15 +2979,15 @@
           <w:tcPr>
             <w:tcW w:type="dxa" w:w="1872"/>
             <w:tcBorders>
-              <w:top w:val="none" w:sz="4" w:space="0" w:color="000000"/>
-              <w:bottom w:val="none" w:sz="4" w:space="0" w:color="000000"/>
+              <w:top w:val="none" w:sz="6" w:space="0" w:color="000000"/>
+              <w:bottom w:val="none" w:sz="6" w:space="0" w:color="000000"/>
               <w:left w:val="none"/>
               <w:right w:val="none"/>
             </w:tcBorders>
           </w:tcPr>
           <w:p>
             <w:pPr>
-              <w:spacing w:before="40" w:after="40" w:line="240" w:lineRule="auto"/>
+              <w:spacing w:before="60" w:after="60" w:line="240" w:lineRule="auto"/>
             </w:pPr>
             <w:r/>
             <w:r>
@@ -3004,15 +3004,15 @@
           <w:tcPr>
             <w:tcW w:type="dxa" w:w="1872"/>
             <w:tcBorders>
-              <w:top w:val="none" w:sz="4" w:space="0" w:color="000000"/>
-              <w:bottom w:val="none" w:sz="4" w:space="0" w:color="000000"/>
+              <w:top w:val="none" w:sz="6" w:space="0" w:color="000000"/>
+              <w:bottom w:val="none" w:sz="6" w:space="0" w:color="000000"/>
               <w:left w:val="none"/>
               <w:right w:val="none"/>
             </w:tcBorders>
           </w:tcPr>
           <w:p>
             <w:pPr>
-              <w:spacing w:before="40" w:after="40" w:line="240" w:lineRule="auto"/>
+              <w:spacing w:before="60" w:after="60" w:line="240" w:lineRule="auto"/>
             </w:pPr>
             <w:r/>
             <w:r>
@@ -3029,15 +3029,15 @@
           <w:tcPr>
             <w:tcW w:type="dxa" w:w="1872"/>
             <w:tcBorders>
-              <w:top w:val="none" w:sz="4" w:space="0" w:color="000000"/>
-              <w:bottom w:val="none" w:sz="4" w:space="0" w:color="000000"/>
+              <w:top w:val="none" w:sz="6" w:space="0" w:color="000000"/>
+              <w:bottom w:val="none" w:sz="6" w:space="0" w:color="000000"/>
               <w:left w:val="none"/>
               <w:right w:val="none"/>
             </w:tcBorders>
           </w:tcPr>
           <w:p>
             <w:pPr>
-              <w:spacing w:before="40" w:after="40" w:line="240" w:lineRule="auto"/>
+              <w:spacing w:before="60" w:after="60" w:line="240" w:lineRule="auto"/>
             </w:pPr>
             <w:r/>
             <w:r>
@@ -3056,15 +3056,15 @@
           <w:tcPr>
             <w:tcW w:type="dxa" w:w="1872"/>
             <w:tcBorders>
-              <w:top w:val="none" w:sz="4" w:space="0" w:color="000000"/>
-              <w:bottom w:val="none" w:sz="4" w:space="0" w:color="000000"/>
+              <w:top w:val="none" w:sz="6" w:space="0" w:color="000000"/>
+              <w:bottom w:val="none" w:sz="6" w:space="0" w:color="000000"/>
               <w:left w:val="none"/>
               <w:right w:val="none"/>
             </w:tcBorders>
           </w:tcPr>
           <w:p>
             <w:pPr>
-              <w:spacing w:before="40" w:after="40" w:line="240" w:lineRule="auto"/>
+              <w:spacing w:before="60" w:after="60" w:line="240" w:lineRule="auto"/>
             </w:pPr>
             <w:r/>
             <w:r>
@@ -3081,15 +3081,15 @@
           <w:tcPr>
             <w:tcW w:type="dxa" w:w="1872"/>
             <w:tcBorders>
-              <w:top w:val="none" w:sz="4" w:space="0" w:color="000000"/>
-              <w:bottom w:val="none" w:sz="4" w:space="0" w:color="000000"/>
+              <w:top w:val="none" w:sz="6" w:space="0" w:color="000000"/>
+              <w:bottom w:val="none" w:sz="6" w:space="0" w:color="000000"/>
               <w:left w:val="none"/>
               <w:right w:val="none"/>
             </w:tcBorders>
           </w:tcPr>
           <w:p>
             <w:pPr>
-              <w:spacing w:before="40" w:after="40" w:line="240" w:lineRule="auto"/>
+              <w:spacing w:before="60" w:after="60" w:line="240" w:lineRule="auto"/>
             </w:pPr>
             <w:r/>
             <w:r>
@@ -3106,15 +3106,15 @@
           <w:tcPr>
             <w:tcW w:type="dxa" w:w="1872"/>
             <w:tcBorders>
-              <w:top w:val="none" w:sz="4" w:space="0" w:color="000000"/>
-              <w:bottom w:val="none" w:sz="4" w:space="0" w:color="000000"/>
+              <w:top w:val="none" w:sz="6" w:space="0" w:color="000000"/>
+              <w:bottom w:val="none" w:sz="6" w:space="0" w:color="000000"/>
               <w:left w:val="none"/>
               <w:right w:val="none"/>
             </w:tcBorders>
           </w:tcPr>
           <w:p>
             <w:pPr>
-              <w:spacing w:before="40" w:after="40" w:line="240" w:lineRule="auto"/>
+              <w:spacing w:before="60" w:after="60" w:line="240" w:lineRule="auto"/>
             </w:pPr>
             <w:r/>
             <w:r>
@@ -3131,15 +3131,15 @@
           <w:tcPr>
             <w:tcW w:type="dxa" w:w="1872"/>
             <w:tcBorders>
-              <w:top w:val="none" w:sz="4" w:space="0" w:color="000000"/>
-              <w:bottom w:val="none" w:sz="4" w:space="0" w:color="000000"/>
+              <w:top w:val="none" w:sz="6" w:space="0" w:color="000000"/>
+              <w:bottom w:val="none" w:sz="6" w:space="0" w:color="000000"/>
               <w:left w:val="none"/>
               <w:right w:val="none"/>
             </w:tcBorders>
           </w:tcPr>
           <w:p>
             <w:pPr>
-              <w:spacing w:before="40" w:after="40" w:line="240" w:lineRule="auto"/>
+              <w:spacing w:before="60" w:after="60" w:line="240" w:lineRule="auto"/>
             </w:pPr>
             <w:r/>
             <w:r>
@@ -3156,15 +3156,15 @@
           <w:tcPr>
             <w:tcW w:type="dxa" w:w="1872"/>
             <w:tcBorders>
-              <w:top w:val="none" w:sz="4" w:space="0" w:color="000000"/>
-              <w:bottom w:val="none" w:sz="4" w:space="0" w:color="000000"/>
+              <w:top w:val="none" w:sz="6" w:space="0" w:color="000000"/>
+              <w:bottom w:val="none" w:sz="6" w:space="0" w:color="000000"/>
               <w:left w:val="none"/>
               <w:right w:val="none"/>
             </w:tcBorders>
           </w:tcPr>
           <w:p>
             <w:pPr>
-              <w:spacing w:before="40" w:after="40" w:line="240" w:lineRule="auto"/>
+              <w:spacing w:before="60" w:after="60" w:line="240" w:lineRule="auto"/>
             </w:pPr>
             <w:r/>
             <w:r>
@@ -3183,15 +3183,15 @@
           <w:tcPr>
             <w:tcW w:type="dxa" w:w="1872"/>
             <w:tcBorders>
-              <w:top w:val="none" w:sz="4" w:space="0" w:color="000000"/>
-              <w:bottom w:val="none" w:sz="4" w:space="0" w:color="000000"/>
+              <w:top w:val="none" w:sz="6" w:space="0" w:color="000000"/>
+              <w:bottom w:val="none" w:sz="6" w:space="0" w:color="000000"/>
               <w:left w:val="none"/>
               <w:right w:val="none"/>
             </w:tcBorders>
           </w:tcPr>
           <w:p>
             <w:pPr>
-              <w:spacing w:before="40" w:after="40" w:line="240" w:lineRule="auto"/>
+              <w:spacing w:before="60" w:after="60" w:line="240" w:lineRule="auto"/>
             </w:pPr>
             <w:r/>
             <w:r>
@@ -3208,15 +3208,15 @@
           <w:tcPr>
             <w:tcW w:type="dxa" w:w="1872"/>
             <w:tcBorders>
-              <w:top w:val="none" w:sz="4" w:space="0" w:color="000000"/>
-              <w:bottom w:val="none" w:sz="4" w:space="0" w:color="000000"/>
+              <w:top w:val="none" w:sz="6" w:space="0" w:color="000000"/>
+              <w:bottom w:val="none" w:sz="6" w:space="0" w:color="000000"/>
               <w:left w:val="none"/>
               <w:right w:val="none"/>
             </w:tcBorders>
           </w:tcPr>
           <w:p>
             <w:pPr>
-              <w:spacing w:before="40" w:after="40" w:line="240" w:lineRule="auto"/>
+              <w:spacing w:before="60" w:after="60" w:line="240" w:lineRule="auto"/>
             </w:pPr>
             <w:r/>
             <w:r>
@@ -3233,15 +3233,15 @@
           <w:tcPr>
             <w:tcW w:type="dxa" w:w="1872"/>
             <w:tcBorders>
-              <w:top w:val="none" w:sz="4" w:space="0" w:color="000000"/>
-              <w:bottom w:val="none" w:sz="4" w:space="0" w:color="000000"/>
+              <w:top w:val="none" w:sz="6" w:space="0" w:color="000000"/>
+              <w:bottom w:val="none" w:sz="6" w:space="0" w:color="000000"/>
               <w:left w:val="none"/>
               <w:right w:val="none"/>
             </w:tcBorders>
           </w:tcPr>
           <w:p>
             <w:pPr>
-              <w:spacing w:before="40" w:after="40" w:line="240" w:lineRule="auto"/>
+              <w:spacing w:before="60" w:after="60" w:line="240" w:lineRule="auto"/>
             </w:pPr>
             <w:r/>
             <w:r>
@@ -3258,15 +3258,15 @@
           <w:tcPr>
             <w:tcW w:type="dxa" w:w="1872"/>
             <w:tcBorders>
-              <w:top w:val="none" w:sz="4" w:space="0" w:color="000000"/>
-              <w:bottom w:val="none" w:sz="4" w:space="0" w:color="000000"/>
+              <w:top w:val="none" w:sz="6" w:space="0" w:color="000000"/>
+              <w:bottom w:val="none" w:sz="6" w:space="0" w:color="000000"/>
               <w:left w:val="none"/>
               <w:right w:val="none"/>
             </w:tcBorders>
           </w:tcPr>
           <w:p>
             <w:pPr>
-              <w:spacing w:before="40" w:after="40" w:line="240" w:lineRule="auto"/>
+              <w:spacing w:before="60" w:after="60" w:line="240" w:lineRule="auto"/>
             </w:pPr>
             <w:r/>
             <w:r>
@@ -3283,15 +3283,15 @@
           <w:tcPr>
             <w:tcW w:type="dxa" w:w="1872"/>
             <w:tcBorders>
-              <w:top w:val="none" w:sz="4" w:space="0" w:color="000000"/>
-              <w:bottom w:val="none" w:sz="4" w:space="0" w:color="000000"/>
+              <w:top w:val="none" w:sz="6" w:space="0" w:color="000000"/>
+              <w:bottom w:val="none" w:sz="6" w:space="0" w:color="000000"/>
               <w:left w:val="none"/>
               <w:right w:val="none"/>
             </w:tcBorders>
           </w:tcPr>
           <w:p>
             <w:pPr>
-              <w:spacing w:before="40" w:after="40" w:line="240" w:lineRule="auto"/>
+              <w:spacing w:before="60" w:after="60" w:line="240" w:lineRule="auto"/>
             </w:pPr>
             <w:r/>
             <w:r>
@@ -3310,15 +3310,15 @@
           <w:tcPr>
             <w:tcW w:type="dxa" w:w="1872"/>
             <w:tcBorders>
-              <w:top w:val="none" w:sz="4" w:space="0" w:color="000000"/>
-              <w:bottom w:val="none" w:sz="4" w:space="0" w:color="000000"/>
+              <w:top w:val="none" w:sz="6" w:space="0" w:color="000000"/>
+              <w:bottom w:val="none" w:sz="6" w:space="0" w:color="000000"/>
               <w:left w:val="none"/>
               <w:right w:val="none"/>
             </w:tcBorders>
           </w:tcPr>
           <w:p>
             <w:pPr>
-              <w:spacing w:before="40" w:after="40" w:line="240" w:lineRule="auto"/>
+              <w:spacing w:before="60" w:after="60" w:line="240" w:lineRule="auto"/>
             </w:pPr>
             <w:r/>
             <w:r>
@@ -3335,15 +3335,15 @@
           <w:tcPr>
             <w:tcW w:type="dxa" w:w="1872"/>
             <w:tcBorders>
-              <w:top w:val="none" w:sz="4" w:space="0" w:color="000000"/>
-              <w:bottom w:val="none" w:sz="4" w:space="0" w:color="000000"/>
+              <w:top w:val="none" w:sz="6" w:space="0" w:color="000000"/>
+              <w:bottom w:val="none" w:sz="6" w:space="0" w:color="000000"/>
               <w:left w:val="none"/>
               <w:right w:val="none"/>
             </w:tcBorders>
           </w:tcPr>
           <w:p>
             <w:pPr>
-              <w:spacing w:before="40" w:after="40" w:line="240" w:lineRule="auto"/>
+              <w:spacing w:before="60" w:after="60" w:line="240" w:lineRule="auto"/>
             </w:pPr>
             <w:r/>
             <w:r>
@@ -3360,15 +3360,15 @@
           <w:tcPr>
             <w:tcW w:type="dxa" w:w="1872"/>
             <w:tcBorders>
-              <w:top w:val="none" w:sz="4" w:space="0" w:color="000000"/>
-              <w:bottom w:val="none" w:sz="4" w:space="0" w:color="000000"/>
+              <w:top w:val="none" w:sz="6" w:space="0" w:color="000000"/>
+              <w:bottom w:val="none" w:sz="6" w:space="0" w:color="000000"/>
               <w:left w:val="none"/>
               <w:right w:val="none"/>
             </w:tcBorders>
           </w:tcPr>
           <w:p>
             <w:pPr>
-              <w:spacing w:before="40" w:after="40" w:line="240" w:lineRule="auto"/>
+              <w:spacing w:before="60" w:after="60" w:line="240" w:lineRule="auto"/>
             </w:pPr>
             <w:r/>
             <w:r>
@@ -3385,15 +3385,15 @@
           <w:tcPr>
             <w:tcW w:type="dxa" w:w="1872"/>
             <w:tcBorders>
-              <w:top w:val="none" w:sz="4" w:space="0" w:color="000000"/>
-              <w:bottom w:val="none" w:sz="4" w:space="0" w:color="000000"/>
+              <w:top w:val="none" w:sz="6" w:space="0" w:color="000000"/>
+              <w:bottom w:val="none" w:sz="6" w:space="0" w:color="000000"/>
               <w:left w:val="none"/>
               <w:right w:val="none"/>
             </w:tcBorders>
           </w:tcPr>
           <w:p>
             <w:pPr>
-              <w:spacing w:before="40" w:after="40" w:line="240" w:lineRule="auto"/>
+              <w:spacing w:before="60" w:after="60" w:line="240" w:lineRule="auto"/>
             </w:pPr>
             <w:r/>
             <w:r>
@@ -3410,15 +3410,15 @@
           <w:tcPr>
             <w:tcW w:type="dxa" w:w="1872"/>
             <w:tcBorders>
-              <w:top w:val="none" w:sz="4" w:space="0" w:color="000000"/>
-              <w:bottom w:val="none" w:sz="4" w:space="0" w:color="000000"/>
+              <w:top w:val="none" w:sz="6" w:space="0" w:color="000000"/>
+              <w:bottom w:val="none" w:sz="6" w:space="0" w:color="000000"/>
               <w:left w:val="none"/>
               <w:right w:val="none"/>
             </w:tcBorders>
           </w:tcPr>
           <w:p>
             <w:pPr>
-              <w:spacing w:before="40" w:after="40" w:line="240" w:lineRule="auto"/>
+              <w:spacing w:before="60" w:after="60" w:line="240" w:lineRule="auto"/>
             </w:pPr>
             <w:r/>
             <w:r>
@@ -3437,15 +3437,15 @@
           <w:tcPr>
             <w:tcW w:type="dxa" w:w="1872"/>
             <w:tcBorders>
-              <w:top w:val="none" w:sz="4" w:space="0" w:color="000000"/>
-              <w:bottom w:val="none" w:sz="4" w:space="0" w:color="000000"/>
+              <w:top w:val="none" w:sz="6" w:space="0" w:color="000000"/>
+              <w:bottom w:val="none" w:sz="6" w:space="0" w:color="000000"/>
               <w:left w:val="none"/>
               <w:right w:val="none"/>
             </w:tcBorders>
           </w:tcPr>
           <w:p>
             <w:pPr>
-              <w:spacing w:before="40" w:after="40" w:line="240" w:lineRule="auto"/>
+              <w:spacing w:before="60" w:after="60" w:line="240" w:lineRule="auto"/>
             </w:pPr>
             <w:r/>
             <w:r>
@@ -3462,15 +3462,15 @@
           <w:tcPr>
             <w:tcW w:type="dxa" w:w="1872"/>
             <w:tcBorders>
-              <w:top w:val="none" w:sz="4" w:space="0" w:color="000000"/>
-              <w:bottom w:val="none" w:sz="4" w:space="0" w:color="000000"/>
+              <w:top w:val="none" w:sz="6" w:space="0" w:color="000000"/>
+              <w:bottom w:val="none" w:sz="6" w:space="0" w:color="000000"/>
               <w:left w:val="none"/>
               <w:right w:val="none"/>
             </w:tcBorders>
           </w:tcPr>
           <w:p>
             <w:pPr>
-              <w:spacing w:before="40" w:after="40" w:line="240" w:lineRule="auto"/>
+              <w:spacing w:before="60" w:after="60" w:line="240" w:lineRule="auto"/>
             </w:pPr>
             <w:r/>
             <w:r>
@@ -3487,15 +3487,15 @@
           <w:tcPr>
             <w:tcW w:type="dxa" w:w="1872"/>
             <w:tcBorders>
-              <w:top w:val="none" w:sz="4" w:space="0" w:color="000000"/>
-              <w:bottom w:val="none" w:sz="4" w:space="0" w:color="000000"/>
+              <w:top w:val="none" w:sz="6" w:space="0" w:color="000000"/>
+              <w:bottom w:val="none" w:sz="6" w:space="0" w:color="000000"/>
               <w:left w:val="none"/>
               <w:right w:val="none"/>
             </w:tcBorders>
           </w:tcPr>
           <w:p>
             <w:pPr>
-              <w:spacing w:before="40" w:after="40" w:line="240" w:lineRule="auto"/>
+              <w:spacing w:before="60" w:after="60" w:line="240" w:lineRule="auto"/>
             </w:pPr>
             <w:r/>
             <w:r>
@@ -3512,15 +3512,15 @@
           <w:tcPr>
             <w:tcW w:type="dxa" w:w="1872"/>
             <w:tcBorders>
-              <w:top w:val="none" w:sz="4" w:space="0" w:color="000000"/>
-              <w:bottom w:val="none" w:sz="4" w:space="0" w:color="000000"/>
+              <w:top w:val="none" w:sz="6" w:space="0" w:color="000000"/>
+              <w:bottom w:val="none" w:sz="6" w:space="0" w:color="000000"/>
               <w:left w:val="none"/>
               <w:right w:val="none"/>
             </w:tcBorders>
           </w:tcPr>
           <w:p>
             <w:pPr>
-              <w:spacing w:before="40" w:after="40" w:line="240" w:lineRule="auto"/>
+              <w:spacing w:before="60" w:after="60" w:line="240" w:lineRule="auto"/>
             </w:pPr>
             <w:r/>
             <w:r>
@@ -3537,15 +3537,15 @@
           <w:tcPr>
             <w:tcW w:type="dxa" w:w="1872"/>
             <w:tcBorders>
-              <w:top w:val="none" w:sz="4" w:space="0" w:color="000000"/>
-              <w:bottom w:val="none" w:sz="4" w:space="0" w:color="000000"/>
+              <w:top w:val="none" w:sz="6" w:space="0" w:color="000000"/>
+              <w:bottom w:val="none" w:sz="6" w:space="0" w:color="000000"/>
               <w:left w:val="none"/>
               <w:right w:val="none"/>
             </w:tcBorders>
           </w:tcPr>
           <w:p>
             <w:pPr>
-              <w:spacing w:before="40" w:after="40" w:line="240" w:lineRule="auto"/>
+              <w:spacing w:before="60" w:after="60" w:line="240" w:lineRule="auto"/>
             </w:pPr>
             <w:r/>
             <w:r>
@@ -3564,15 +3564,15 @@
           <w:tcPr>
             <w:tcW w:type="dxa" w:w="1872"/>
             <w:tcBorders>
-              <w:top w:val="none" w:sz="4" w:space="0" w:color="000000"/>
-              <w:bottom w:val="none" w:sz="4" w:space="0" w:color="000000"/>
+              <w:top w:val="none" w:sz="6" w:space="0" w:color="000000"/>
+              <w:bottom w:val="none" w:sz="6" w:space="0" w:color="000000"/>
               <w:left w:val="none"/>
               <w:right w:val="none"/>
             </w:tcBorders>
           </w:tcPr>
           <w:p>
             <w:pPr>
-              <w:spacing w:before="40" w:after="40" w:line="240" w:lineRule="auto"/>
+              <w:spacing w:before="60" w:after="60" w:line="240" w:lineRule="auto"/>
             </w:pPr>
             <w:r/>
             <w:r>
@@ -3589,15 +3589,15 @@
           <w:tcPr>
             <w:tcW w:type="dxa" w:w="1872"/>
             <w:tcBorders>
-              <w:top w:val="none" w:sz="4" w:space="0" w:color="000000"/>
-              <w:bottom w:val="none" w:sz="4" w:space="0" w:color="000000"/>
+              <w:top w:val="none" w:sz="6" w:space="0" w:color="000000"/>
+              <w:bottom w:val="none" w:sz="6" w:space="0" w:color="000000"/>
               <w:left w:val="none"/>
               <w:right w:val="none"/>
             </w:tcBorders>
           </w:tcPr>
           <w:p>
             <w:pPr>
-              <w:spacing w:before="40" w:after="40" w:line="240" w:lineRule="auto"/>
+              <w:spacing w:before="60" w:after="60" w:line="240" w:lineRule="auto"/>
             </w:pPr>
             <w:r/>
             <w:r>
@@ -3614,15 +3614,15 @@
           <w:tcPr>
             <w:tcW w:type="dxa" w:w="1872"/>
             <w:tcBorders>
-              <w:top w:val="none" w:sz="4" w:space="0" w:color="000000"/>
-              <w:bottom w:val="none" w:sz="4" w:space="0" w:color="000000"/>
+              <w:top w:val="none" w:sz="6" w:space="0" w:color="000000"/>
+              <w:bottom w:val="none" w:sz="6" w:space="0" w:color="000000"/>
               <w:left w:val="none"/>
               <w:right w:val="none"/>
             </w:tcBorders>
           </w:tcPr>
           <w:p>
             <w:pPr>
-              <w:spacing w:before="40" w:after="40" w:line="240" w:lineRule="auto"/>
+              <w:spacing w:before="60" w:after="60" w:line="240" w:lineRule="auto"/>
             </w:pPr>
             <w:r/>
             <w:r>
@@ -3639,15 +3639,15 @@
           <w:tcPr>
             <w:tcW w:type="dxa" w:w="1872"/>
             <w:tcBorders>
-              <w:top w:val="none" w:sz="4" w:space="0" w:color="000000"/>
-              <w:bottom w:val="none" w:sz="4" w:space="0" w:color="000000"/>
+              <w:top w:val="none" w:sz="6" w:space="0" w:color="000000"/>
+              <w:bottom w:val="none" w:sz="6" w:space="0" w:color="000000"/>
               <w:left w:val="none"/>
               <w:right w:val="none"/>
             </w:tcBorders>
           </w:tcPr>
           <w:p>
             <w:pPr>
-              <w:spacing w:before="40" w:after="40" w:line="240" w:lineRule="auto"/>
+              <w:spacing w:before="60" w:after="60" w:line="240" w:lineRule="auto"/>
             </w:pPr>
             <w:r/>
             <w:r>
@@ -3664,15 +3664,15 @@
           <w:tcPr>
             <w:tcW w:type="dxa" w:w="1872"/>
             <w:tcBorders>
-              <w:top w:val="none" w:sz="4" w:space="0" w:color="000000"/>
-              <w:bottom w:val="none" w:sz="4" w:space="0" w:color="000000"/>
+              <w:top w:val="none" w:sz="6" w:space="0" w:color="000000"/>
+              <w:bottom w:val="none" w:sz="6" w:space="0" w:color="000000"/>
               <w:left w:val="none"/>
               <w:right w:val="none"/>
             </w:tcBorders>
           </w:tcPr>
           <w:p>
             <w:pPr>
-              <w:spacing w:before="40" w:after="40" w:line="240" w:lineRule="auto"/>
+              <w:spacing w:before="60" w:after="60" w:line="240" w:lineRule="auto"/>
             </w:pPr>
             <w:r/>
             <w:r>
@@ -3691,15 +3691,15 @@
           <w:tcPr>
             <w:tcW w:type="dxa" w:w="1872"/>
             <w:tcBorders>
-              <w:top w:val="none" w:sz="4" w:space="0" w:color="000000"/>
-              <w:bottom w:val="single" w:sz="4" w:space="0" w:color="000000"/>
+              <w:top w:val="none" w:sz="6" w:space="0" w:color="000000"/>
+              <w:bottom w:val="single" w:sz="6" w:space="0" w:color="000000"/>
               <w:left w:val="none"/>
               <w:right w:val="none"/>
             </w:tcBorders>
           </w:tcPr>
           <w:p>
             <w:pPr>
-              <w:spacing w:before="40" w:after="40" w:line="240" w:lineRule="auto"/>
+              <w:spacing w:before="60" w:after="60" w:line="240" w:lineRule="auto"/>
             </w:pPr>
             <w:r/>
             <w:r>
@@ -3716,15 +3716,15 @@
           <w:tcPr>
             <w:tcW w:type="dxa" w:w="1872"/>
             <w:tcBorders>
-              <w:top w:val="none" w:sz="4" w:space="0" w:color="000000"/>
-              <w:bottom w:val="single" w:sz="4" w:space="0" w:color="000000"/>
+              <w:top w:val="none" w:sz="6" w:space="0" w:color="000000"/>
+              <w:bottom w:val="single" w:sz="6" w:space="0" w:color="000000"/>
               <w:left w:val="none"/>
               <w:right w:val="none"/>
             </w:tcBorders>
           </w:tcPr>
           <w:p>
             <w:pPr>
-              <w:spacing w:before="40" w:after="40" w:line="240" w:lineRule="auto"/>
+              <w:spacing w:before="60" w:after="60" w:line="240" w:lineRule="auto"/>
             </w:pPr>
             <w:r/>
             <w:r>
@@ -3741,15 +3741,15 @@
           <w:tcPr>
             <w:tcW w:type="dxa" w:w="1872"/>
             <w:tcBorders>
-              <w:top w:val="none" w:sz="4" w:space="0" w:color="000000"/>
-              <w:bottom w:val="single" w:sz="4" w:space="0" w:color="000000"/>
+              <w:top w:val="none" w:sz="6" w:space="0" w:color="000000"/>
+              <w:bottom w:val="single" w:sz="6" w:space="0" w:color="000000"/>
               <w:left w:val="none"/>
               <w:right w:val="none"/>
             </w:tcBorders>
           </w:tcPr>
           <w:p>
             <w:pPr>
-              <w:spacing w:before="40" w:after="40" w:line="240" w:lineRule="auto"/>
+              <w:spacing w:before="60" w:after="60" w:line="240" w:lineRule="auto"/>
             </w:pPr>
             <w:r/>
             <w:r>
@@ -3766,15 +3766,15 @@
           <w:tcPr>
             <w:tcW w:type="dxa" w:w="1872"/>
             <w:tcBorders>
-              <w:top w:val="none" w:sz="4" w:space="0" w:color="000000"/>
-              <w:bottom w:val="single" w:sz="4" w:space="0" w:color="000000"/>
+              <w:top w:val="none" w:sz="6" w:space="0" w:color="000000"/>
+              <w:bottom w:val="single" w:sz="6" w:space="0" w:color="000000"/>
               <w:left w:val="none"/>
               <w:right w:val="none"/>
             </w:tcBorders>
           </w:tcPr>
           <w:p>
             <w:pPr>
-              <w:spacing w:before="40" w:after="40" w:line="240" w:lineRule="auto"/>
+              <w:spacing w:before="60" w:after="60" w:line="240" w:lineRule="auto"/>
             </w:pPr>
             <w:r/>
             <w:r>
@@ -3791,15 +3791,15 @@
           <w:tcPr>
             <w:tcW w:type="dxa" w:w="1872"/>
             <w:tcBorders>
-              <w:top w:val="none" w:sz="4" w:space="0" w:color="000000"/>
-              <w:bottom w:val="single" w:sz="4" w:space="0" w:color="000000"/>
+              <w:top w:val="none" w:sz="6" w:space="0" w:color="000000"/>
+              <w:bottom w:val="single" w:sz="6" w:space="0" w:color="000000"/>
               <w:left w:val="none"/>
               <w:right w:val="none"/>
             </w:tcBorders>
           </w:tcPr>
           <w:p>
             <w:pPr>
-              <w:spacing w:before="40" w:after="40" w:line="240" w:lineRule="auto"/>
+              <w:spacing w:before="60" w:after="60" w:line="240" w:lineRule="auto"/>
             </w:pPr>
             <w:r/>
             <w:r>
@@ -3817,7 +3817,7 @@
     <w:p>
       <w:pPr>
         <w:spacing w:before="0" w:after="120" w:line="276" w:lineRule="auto"/>
-        <w:jc w:val="left"/>
+        <w:jc w:val="both"/>
       </w:pPr>
     </w:p>
     <w:p>
@@ -4092,15 +4092,15 @@
     </w:p>
     <w:p>
       <w:pPr>
-        <w:spacing w:before="0" w:after="120" w:line="276" w:lineRule="auto"/>
-        <w:jc w:val="both"/>
+        <w:spacing w:before="40" w:after="60" w:line="276" w:lineRule="auto"/>
+        <w:jc w:val="center"/>
       </w:pPr>
       <w:r>
         <w:rPr>
           <w:rFonts w:ascii="Times New Roman" w:hAnsi="Times New Roman"/>
           <w:b w:val="0"/>
           <w:i w:val="0"/>
-          <w:sz w:val="24"/>
+          <w:sz w:val="22"/>
         </w:rPr>
         <w:t>This study was conducted in the Department of Microbiology, Faculty of Science, University of Ibadan, Nigeria. Computational platform development and data curation were conducted independently without external financial grants.</w:t>
       </w:r>
@@ -4122,22 +4122,22 @@
     </w:p>
     <w:p>
       <w:pPr>
-        <w:spacing w:before="0" w:after="120" w:line="276" w:lineRule="auto"/>
-        <w:jc w:val="both"/>
+        <w:spacing w:before="40" w:after="60" w:line="276" w:lineRule="auto"/>
+        <w:jc w:val="center"/>
       </w:pPr>
       <w:r>
         <w:rPr>
           <w:rFonts w:ascii="Times New Roman" w:hAnsi="Times New Roman"/>
           <w:b w:val="0"/>
           <w:i w:val="0"/>
-          <w:sz w:val="24"/>
+          <w:sz w:val="22"/>
         </w:rPr>
         <w:t>The authors acknowledge the laboratory staff and academic colleagues of the Department of Microbiology, University of Ibadan, for technical and institutional guidance throughout the original experimental research.</w:t>
       </w:r>
     </w:p>
     <w:p>
       <w:pPr>
-        <w:spacing w:before="280" w:after="120" w:line="276" w:lineRule="auto"/>
+        <w:spacing w:before="320" w:after="160" w:line="276" w:lineRule="auto"/>
         <w:jc w:val="left"/>
       </w:pPr>
       <w:r>
@@ -4152,7 +4152,8 @@
     </w:p>
     <w:p>
       <w:pPr>
-        <w:spacing w:before="40" w:after="80" w:line="276" w:lineRule="auto"/>
+        <w:spacing w:before="0" w:after="120" w:line="276" w:lineRule="auto"/>
+        <w:ind w:left="720" w:hanging="720"/>
         <w:jc w:val="both"/>
       </w:pPr>
       <w:r>
@@ -4160,14 +4161,15 @@
           <w:rFonts w:ascii="Times New Roman" w:hAnsi="Times New Roman"/>
           <w:b w:val="0"/>
           <w:i w:val="0"/>
-          <w:sz w:val="24"/>
+          <w:sz w:val="22"/>
         </w:rPr>
-        <w:t>1. Adetunji, V. O. and Salawu, O. T. (2008). African soft cheese (Wara) produced from Calotropis procera and Carica papaya: a comparative assessment of nutritional value and consumer acceptability. African Journal of Biotechnology, 7(18): 3352-3355.</w:t>
+        <w:t>Adetunji, V. O. and Salawu, O. T. (2008). African soft cheese (Wara) produced from Calotropis procera and Carica papaya: a comparative assessment of nutritional value and consumer acceptability. African Journal of Biotechnology, 7(18): 3352-3355.</w:t>
       </w:r>
     </w:p>
     <w:p>
       <w:pPr>
-        <w:spacing w:before="40" w:after="80" w:line="276" w:lineRule="auto"/>
+        <w:spacing w:before="0" w:after="120" w:line="276" w:lineRule="auto"/>
+        <w:ind w:left="720" w:hanging="720"/>
         <w:jc w:val="both"/>
       </w:pPr>
       <w:r>
@@ -4175,14 +4177,15 @@
           <w:rFonts w:ascii="Times New Roman" w:hAnsi="Times New Roman"/>
           <w:b w:val="0"/>
           <w:i w:val="0"/>
-          <w:sz w:val="24"/>
+          <w:sz w:val="22"/>
         </w:rPr>
-        <w:t>2. Akinyemi, M. O. and AK, A. (2021). A review of microbes and chemical contaminants in dairy products. Comprehensive Reviews in Food Science and Food Safety, 20(2): 1188-1205.</w:t>
+        <w:t>Akinyemi, M. O. and AK, A. (2021). A review of microbes and chemical contaminants in dairy products. Comprehensive Reviews in Food Science and Food Safety, 20(2): 1188-1205.</w:t>
       </w:r>
     </w:p>
     <w:p>
       <w:pPr>
-        <w:spacing w:before="40" w:after="80" w:line="276" w:lineRule="auto"/>
+        <w:spacing w:before="0" w:after="120" w:line="276" w:lineRule="auto"/>
+        <w:ind w:left="720" w:hanging="720"/>
         <w:jc w:val="both"/>
       </w:pPr>
       <w:r>
@@ -4190,14 +4193,15 @@
           <w:rFonts w:ascii="Times New Roman" w:hAnsi="Times New Roman"/>
           <w:b w:val="0"/>
           <w:i w:val="0"/>
-          <w:sz w:val="24"/>
+          <w:sz w:val="22"/>
         </w:rPr>
-        <w:t>3. Alonso, C. A., Dominguez, L. and Zarazaga, M. (2020). Occurrence of antibiotic-resistant bacteria in dairy foods. Trends in Food Science and Technology, 102: 72-81.</w:t>
+        <w:t>Alonso, C. A., Dominguez, L. and Zarazaga, M. (2020). Occurrence of antibiotic-resistant bacteria in dairy foods. Trends in Food Science and Technology, 102: 72-81.</w:t>
       </w:r>
     </w:p>
     <w:p>
       <w:pPr>
-        <w:spacing w:before="40" w:after="80" w:line="276" w:lineRule="auto"/>
+        <w:spacing w:before="0" w:after="120" w:line="276" w:lineRule="auto"/>
+        <w:ind w:left="720" w:hanging="720"/>
         <w:jc w:val="both"/>
       </w:pPr>
       <w:r>
@@ -4205,14 +4209,15 @@
           <w:rFonts w:ascii="Times New Roman" w:hAnsi="Times New Roman"/>
           <w:b w:val="0"/>
           <w:i w:val="0"/>
-          <w:sz w:val="24"/>
+          <w:sz w:val="22"/>
         </w:rPr>
-        <w:t>4. Banwo, K. and Adeyemo, I. (2013). Technological and probiotic potential of Lactobacillus plantarum isolated from traditional fermented food products in Nigeria. Journal of Applied Microbiology, 117(3): 820-834.</w:t>
+        <w:t>Banwo, K. and Adeyemo, I. (2013). Technological and probiotic potential of Lactobacillus plantarum isolated from traditional fermented food products in Nigeria. Journal of Applied Microbiology, 117(3): 820-834.</w:t>
       </w:r>
     </w:p>
     <w:p>
       <w:pPr>
-        <w:spacing w:before="40" w:after="80" w:line="276" w:lineRule="auto"/>
+        <w:spacing w:before="0" w:after="120" w:line="276" w:lineRule="auto"/>
+        <w:ind w:left="720" w:hanging="720"/>
         <w:jc w:val="both"/>
       </w:pPr>
       <w:r>
@@ -4220,14 +4225,15 @@
           <w:rFonts w:ascii="Times New Roman" w:hAnsi="Times New Roman"/>
           <w:b w:val="0"/>
           <w:i w:val="0"/>
-          <w:sz w:val="24"/>
+          <w:sz w:val="22"/>
         </w:rPr>
-        <w:t>5. Boudra, H. and BJ, B. (2007). Aflatoxin M1 and ochratoxin A in raw bulk milk from French dairy herds. Journal of Dairy Science, 90(7): 3197-3201.</w:t>
+        <w:t>Boudra, H. and BJ, B. (2007). Aflatoxin M1 and ochratoxin A in raw bulk milk from French dairy herds. Journal of Dairy Science, 90(7): 3197-3201.</w:t>
       </w:r>
     </w:p>
     <w:p>
       <w:pPr>
-        <w:spacing w:before="40" w:after="80" w:line="276" w:lineRule="auto"/>
+        <w:spacing w:before="0" w:after="120" w:line="276" w:lineRule="auto"/>
+        <w:ind w:left="720" w:hanging="720"/>
         <w:jc w:val="both"/>
       </w:pPr>
       <w:r>
@@ -4235,14 +4241,15 @@
           <w:rFonts w:ascii="Times New Roman" w:hAnsi="Times New Roman"/>
           <w:b w:val="0"/>
           <w:i w:val="0"/>
-          <w:sz w:val="24"/>
+          <w:sz w:val="22"/>
         </w:rPr>
-        <w:t>6. Dror, D. K. and Allen, L. H. (2011). The importance of milk and other animal-source foods for children in low-income countries. Food and Nutrition Bulletin, 32(3): 227-243.</w:t>
+        <w:t>Dror, D. K. and Allen, L. H. (2011). The importance of milk and other animal-source foods for children in low-income countries. Food and Nutrition Bulletin, 32(3): 227-243.</w:t>
       </w:r>
     </w:p>
     <w:p>
       <w:pPr>
-        <w:spacing w:before="40" w:after="80" w:line="276" w:lineRule="auto"/>
+        <w:spacing w:before="0" w:after="120" w:line="276" w:lineRule="auto"/>
+        <w:ind w:left="720" w:hanging="720"/>
         <w:jc w:val="both"/>
       </w:pPr>
       <w:r>
@@ -4250,14 +4257,15 @@
           <w:rFonts w:ascii="Times New Roman" w:hAnsi="Times New Roman"/>
           <w:b w:val="0"/>
           <w:i w:val="0"/>
-          <w:sz w:val="24"/>
+          <w:sz w:val="22"/>
         </w:rPr>
-        <w:t>7. Fawole, M. O. and Oso, B. A. (2004). Characterisation of Bacteria. In: Laboratory Manual of Microbiology. 4th ed. Spectrum Books Ltd., Ibadan, Nigeria, pp. 24-35.</w:t>
+        <w:t>Fawole, M. O. and Oso, B. A. (2004). Characterisation of Bacteria. In: Laboratory Manual of Microbiology. 4th ed. Spectrum Books Ltd., Ibadan, Nigeria, pp. 24-35.</w:t>
       </w:r>
     </w:p>
     <w:p>
       <w:pPr>
-        <w:spacing w:before="40" w:after="80" w:line="276" w:lineRule="auto"/>
+        <w:spacing w:before="0" w:after="120" w:line="276" w:lineRule="auto"/>
+        <w:ind w:left="720" w:hanging="720"/>
         <w:jc w:val="both"/>
       </w:pPr>
       <w:r>
@@ -4265,14 +4273,15 @@
           <w:rFonts w:ascii="Times New Roman" w:hAnsi="Times New Roman"/>
           <w:b w:val="0"/>
           <w:i w:val="0"/>
-          <w:sz w:val="24"/>
+          <w:sz w:val="22"/>
         </w:rPr>
-        <w:t>8. Gbashi, S. and Adebo, O. A. (2019). Bacterial toxins in fermented dairy products. Trends in Food Science and Technology, 84: 62-74.</w:t>
+        <w:t>Gbashi, S. and Adebo, O. A. (2019). Bacterial toxins in fermented dairy products. Trends in Food Science and Technology, 84: 62-74.</w:t>
       </w:r>
     </w:p>
     <w:p>
       <w:pPr>
-        <w:spacing w:before="40" w:after="80" w:line="276" w:lineRule="auto"/>
+        <w:spacing w:before="0" w:after="120" w:line="276" w:lineRule="auto"/>
+        <w:ind w:left="720" w:hanging="720"/>
         <w:jc w:val="both"/>
       </w:pPr>
       <w:r>
@@ -4280,14 +4289,15 @@
           <w:rFonts w:ascii="Times New Roman" w:hAnsi="Times New Roman"/>
           <w:b w:val="0"/>
           <w:i w:val="0"/>
-          <w:sz w:val="24"/>
+          <w:sz w:val="22"/>
         </w:rPr>
-        <w:t>9. Giraffa, G. (2020). Bacterial safety of fermented dairy foods. Frontiers in Microbiology, 11: 707.</w:t>
+        <w:t>Giraffa, G. (2020). Bacterial safety of fermented dairy foods. Frontiers in Microbiology, 11: 707.</w:t>
       </w:r>
     </w:p>
     <w:p>
       <w:pPr>
-        <w:spacing w:before="40" w:after="80" w:line="276" w:lineRule="auto"/>
+        <w:spacing w:before="0" w:after="120" w:line="276" w:lineRule="auto"/>
+        <w:ind w:left="720" w:hanging="720"/>
         <w:jc w:val="both"/>
       </w:pPr>
       <w:r>
@@ -4295,14 +4305,15 @@
           <w:rFonts w:ascii="Times New Roman" w:hAnsi="Times New Roman"/>
           <w:b w:val="0"/>
           <w:i w:val="0"/>
-          <w:sz w:val="24"/>
+          <w:sz w:val="22"/>
         </w:rPr>
-        <w:t>10. Hamid, T. K. A. and Mustafa, E. (2021). Safety and microbiological assessment of soft cheese (Wara). Journal of Dairy Science and Biotechnology, 56(3): 89-97.</w:t>
+        <w:t>Hamid, T. K. A. and Mustafa, E. (2021). Safety and microbiological assessment of soft cheese (Wara). Journal of Dairy Science and Biotechnology, 56(3): 89-97.</w:t>
       </w:r>
     </w:p>
     <w:p>
       <w:pPr>
-        <w:spacing w:before="40" w:after="80" w:line="276" w:lineRule="auto"/>
+        <w:spacing w:before="0" w:after="120" w:line="276" w:lineRule="auto"/>
+        <w:ind w:left="720" w:hanging="720"/>
         <w:jc w:val="both"/>
       </w:pPr>
       <w:r>
@@ -4310,14 +4321,15 @@
           <w:rFonts w:ascii="Times New Roman" w:hAnsi="Times New Roman"/>
           <w:b w:val="0"/>
           <w:i w:val="0"/>
-          <w:sz w:val="24"/>
+          <w:sz w:val="22"/>
         </w:rPr>
-        <w:t>11. Holt, J. G., Krieg, N. R., Sneath, P. H. A., Staley, J. T. and Williams, S. T. (1994). Bergey's Manual of Determinative Bacteriology. 9th ed. Williams and Wilkins, Baltimore, USA.</w:t>
+        <w:t>Holt, J. G., Krieg, N. R., Sneath, P. H. A., Staley, J. T. and Williams, S. T. (1994). Bergey's Manual of Determinative Bacteriology. 9th ed. Williams and Wilkins, Baltimore, USA.</w:t>
       </w:r>
     </w:p>
     <w:p>
       <w:pPr>
-        <w:spacing w:before="40" w:after="80" w:line="276" w:lineRule="auto"/>
+        <w:spacing w:before="0" w:after="120" w:line="276" w:lineRule="auto"/>
+        <w:ind w:left="720" w:hanging="720"/>
         <w:jc w:val="both"/>
       </w:pPr>
       <w:r>
@@ -4325,14 +4337,15 @@
           <w:rFonts w:ascii="Times New Roman" w:hAnsi="Times New Roman"/>
           <w:b w:val="0"/>
           <w:i w:val="0"/>
-          <w:sz w:val="24"/>
+          <w:sz w:val="22"/>
         </w:rPr>
-        <w:t>12. Holzapfel, W. H., Haberer, P., Geisen, R., Bjorkroth, J. and Schillinger, U. (2020). Taxonomy and important features of probiotic microorganisms in food and nutrition. American Journal of Clinical Nutrition, 73(2): 365S-373S.</w:t>
+        <w:t>Holzapfel, W. H., Haberer, P., Geisen, R., Bjorkroth, J. and Schillinger, U. (2020). Taxonomy and important features of probiotic microorganisms in food and nutrition. American Journal of Clinical Nutrition, 73(2): 365S-373S.</w:t>
       </w:r>
     </w:p>
     <w:p>
       <w:pPr>
-        <w:spacing w:before="40" w:after="80" w:line="276" w:lineRule="auto"/>
+        <w:spacing w:before="0" w:after="120" w:line="276" w:lineRule="auto"/>
+        <w:ind w:left="720" w:hanging="720"/>
         <w:jc w:val="both"/>
       </w:pPr>
       <w:r>
@@ -4340,14 +4353,15 @@
           <w:rFonts w:ascii="Times New Roman" w:hAnsi="Times New Roman"/>
           <w:b w:val="0"/>
           <w:i w:val="0"/>
-          <w:sz w:val="24"/>
+          <w:sz w:val="22"/>
         </w:rPr>
-        <w:t>13. MacFaddin, J. F. (2000). Biochemical Tests for Identification of Medical Bacteria. 3rd ed. Lippincott Williams and Wilkins, Philadelphia, USA.</w:t>
+        <w:t>MacFaddin, J. F. (2000). Biochemical Tests for Identification of Medical Bacteria. 3rd ed. Lippincott Williams and Wilkins, Philadelphia, USA.</w:t>
       </w:r>
     </w:p>
     <w:p>
       <w:pPr>
-        <w:spacing w:before="40" w:after="80" w:line="276" w:lineRule="auto"/>
+        <w:spacing w:before="0" w:after="120" w:line="276" w:lineRule="auto"/>
+        <w:ind w:left="720" w:hanging="720"/>
         <w:jc w:val="both"/>
       </w:pPr>
       <w:r>
@@ -4355,14 +4369,15 @@
           <w:rFonts w:ascii="Times New Roman" w:hAnsi="Times New Roman"/>
           <w:b w:val="0"/>
           <w:i w:val="0"/>
-          <w:sz w:val="24"/>
+          <w:sz w:val="22"/>
         </w:rPr>
-        <w:t>14. Montville, T. J. and Matthews, K. R. (2018). Food Microbiology: An Introduction. 4th ed. ASM Press, Washington, DC, USA.</w:t>
+        <w:t>Montville, T. J. and Matthews, K. R. (2018). Food Microbiology: An Introduction. 4th ed. ASM Press, Washington, DC, USA.</w:t>
       </w:r>
     </w:p>
     <w:p>
       <w:pPr>
-        <w:spacing w:before="40" w:after="80" w:line="276" w:lineRule="auto"/>
+        <w:spacing w:before="0" w:after="120" w:line="276" w:lineRule="auto"/>
+        <w:ind w:left="720" w:hanging="720"/>
         <w:jc w:val="both"/>
       </w:pPr>
       <w:r>
@@ -4370,14 +4385,15 @@
           <w:rFonts w:ascii="Times New Roman" w:hAnsi="Times New Roman"/>
           <w:b w:val="0"/>
           <w:i w:val="0"/>
-          <w:sz w:val="24"/>
+          <w:sz w:val="22"/>
         </w:rPr>
-        <w:t>15. Oguntoyinbo, F. A. (2014). Safety considerations of lactic acid bacteria in fermented indigenous African foods. Food Reviews International, 30(2): 101-129.</w:t>
+        <w:t>Oguntoyinbo, F. A. (2014). Safety considerations of lactic acid bacteria in fermented indigenous African foods. Food Reviews International, 30(2): 101-129.</w:t>
       </w:r>
     </w:p>
     <w:p>
       <w:pPr>
-        <w:spacing w:before="40" w:after="80" w:line="276" w:lineRule="auto"/>
+        <w:spacing w:before="0" w:after="120" w:line="276" w:lineRule="auto"/>
+        <w:ind w:left="720" w:hanging="720"/>
         <w:jc w:val="both"/>
       </w:pPr>
       <w:r>
@@ -4385,14 +4401,15 @@
           <w:rFonts w:ascii="Times New Roman" w:hAnsi="Times New Roman"/>
           <w:b w:val="0"/>
           <w:i w:val="0"/>
-          <w:sz w:val="24"/>
+          <w:sz w:val="22"/>
         </w:rPr>
-        <w:t>16. Osundahunsi, O. F., Aworh, O. C. and Falade, K. O. (2017). Quality assessment of traditional African soft cheese (Wara) produced using vegetable coagulants. Journal of Food Processing and Preservation, 41(4): e13054.</w:t>
+        <w:t>Osundahunsi, O. F., Aworh, O. C. and Falade, K. O. (2017). Quality assessment of traditional African soft cheese (Wara) produced using vegetable coagulants. Journal of Food Processing and Preservation, 41(4): e13054.</w:t>
       </w:r>
     </w:p>
     <w:p>
       <w:pPr>
-        <w:spacing w:before="40" w:after="80" w:line="276" w:lineRule="auto"/>
+        <w:spacing w:before="0" w:after="120" w:line="276" w:lineRule="auto"/>
+        <w:ind w:left="720" w:hanging="720"/>
         <w:jc w:val="both"/>
       </w:pPr>
       <w:r>
@@ -4400,14 +4417,15 @@
           <w:rFonts w:ascii="Times New Roman" w:hAnsi="Times New Roman"/>
           <w:b w:val="0"/>
           <w:i w:val="0"/>
-          <w:sz w:val="24"/>
+          <w:sz w:val="22"/>
         </w:rPr>
-        <w:t>17. Prescott, L. M., Harley, J. P. and Klein, D. A. (2008). Microbiology. 7th ed. McGraw-Hill, New York, USA.</w:t>
+        <w:t>Prescott, L. M., Harley, J. P. and Klein, D. A. (2008). Microbiology. 7th ed. McGraw-Hill, New York, USA.</w:t>
       </w:r>
     </w:p>
     <w:p>
       <w:pPr>
-        <w:spacing w:before="40" w:after="80" w:line="276" w:lineRule="auto"/>
+        <w:spacing w:before="0" w:after="120" w:line="276" w:lineRule="auto"/>
+        <w:ind w:left="720" w:hanging="720"/>
         <w:jc w:val="both"/>
       </w:pPr>
       <w:r>
@@ -4415,14 +4433,15 @@
           <w:rFonts w:ascii="Times New Roman" w:hAnsi="Times New Roman"/>
           <w:b w:val="0"/>
           <w:i w:val="0"/>
-          <w:sz w:val="24"/>
+          <w:sz w:val="22"/>
         </w:rPr>
-        <w:t>18. Quigley, L., O'Sullivan, O., Stanton, C., Beresford, T. P., Ross, R. P., Fitzgerald, G. F. and Cotter, P. D. (2013). The complex microbiota of raw milk. FEMS Microbiology Reviews, 37(5): 664-698.</w:t>
+        <w:t>Quigley, L., O'Sullivan, O., Stanton, C., Beresford, T. P., Ross, R. P., Fitzgerald, G. F. and Cotter, P. D. (2013). The complex microbiota of raw milk. FEMS Microbiology Reviews, 37(5): 664-698.</w:t>
       </w:r>
     </w:p>
     <w:p>
       <w:pPr>
-        <w:spacing w:before="40" w:after="80" w:line="276" w:lineRule="auto"/>
+        <w:spacing w:before="0" w:after="120" w:line="276" w:lineRule="auto"/>
+        <w:ind w:left="720" w:hanging="720"/>
         <w:jc w:val="both"/>
       </w:pPr>
       <w:r>
@@ -4430,9 +4449,9 @@
           <w:rFonts w:ascii="Times New Roman" w:hAnsi="Times New Roman"/>
           <w:b w:val="0"/>
           <w:i w:val="0"/>
-          <w:sz w:val="24"/>
+          <w:sz w:val="22"/>
         </w:rPr>
-        <w:t>19. WHO (2017). Global Priority List of Antibiotic-Resistant Bacteria to Guide Research, Discovery, and Development of New Antibiotics. World Health Organization, Geneva, Switzerland.</w:t>
+        <w:t>WHO (2017). Global Priority List of Antibiotic-Resistant Bacteria to Guide Research, Discovery, and Development of New Antibiotics. World Health Organization, Geneva, Switzerland.</w:t>
       </w:r>
     </w:p>
     <w:sectPr>

</xml_diff>

<commit_message>
fix(manuscript): set Udochukwu Michael Odoemenam as sole author, correctly attribute supervisor Dr. K. Banwo in Acknowledgements
</commit_message>
<xml_diff>
--- a/docs/MANUSCRIPT_WARA_PATHOGENS.docx
+++ b/docs/MANUSCRIPT_WARA_PATHOGENS.docx
@@ -29,7 +29,7 @@
           <w:i w:val="0"/>
           <w:sz w:val="22"/>
         </w:rPr>
-        <w:t>Udochukwu Michael Odoemenam, K. Banwo</w:t>
+        <w:t>Udochukwu Michael Odoemenam</w:t>
       </w:r>
     </w:p>
     <w:p>
@@ -4072,7 +4072,7 @@
           <w:i w:val="0"/>
           <w:sz w:val="24"/>
         </w:rPr>
-        <w:t>The authors declare that there are no financial or commercial conflicts of interest associated with this research.</w:t>
+        <w:t>The author declares that there are no financial or commercial conflicts of interest associated with this research.</w:t>
       </w:r>
     </w:p>
     <w:p>
@@ -4132,7 +4132,7 @@
           <w:i w:val="0"/>
           <w:sz w:val="22"/>
         </w:rPr>
-        <w:t>The authors acknowledge the laboratory staff and academic colleagues of the Department of Microbiology, University of Ibadan, for technical and institutional guidance throughout the original experimental research.</w:t>
+        <w:t>The author gratefully acknowledges his undergraduate project supervisor, Dr. K. Banwo (Department of Microbiology, Faculty of Science, University of Ibadan), for academic guidance, supervision, and laboratory facilitation during the initial experimental work. The author also thanks the laboratory staff of the Department of Microbiology for technical support. Computational platform development, data architecture, algorithm formulation, and manuscript authorship were conducted independently by the author.</w:t>
       </w:r>
     </w:p>
     <w:p>

</xml_diff>